<commit_message>
Update audit history integrity requirements
</commit_message>
<xml_diff>
--- a/Absolutely KK PMD.docx
+++ b/Absolutely KK PMD.docx
@@ -12056,6 +12056,96 @@
       <w:cols w:space="708"/>
       <w:docGrid w:linePitch="360"/>
     </w:sectPr>
+    <w:p>
+      <w:pPr>
+        <w:pStyle w:val="Heading1"/>
+      </w:pPr>
+      <w:r>
+        <w:t xml:space="preserve">Audit / History Integrity Amendment - 30 September 2026</w:t>
+      </w:r>
+    </w:p>
+    <w:p>
+      <w:r>
+        <w:t xml:space="preserve">This amendment supersedes any earlier statement that Audit/History coverage is complete merely because individual modules emit audit events. The platform foundation exists, but universal coverage remains an implementation gate.</w:t>
+      </w:r>
+    </w:p>
+    <w:p>
+      <w:pPr>
+        <w:pStyle w:val="Heading2"/>
+      </w:pPr>
+      <w:r>
+        <w:t xml:space="preserve">Required platform rule</w:t>
+      </w:r>
+    </w:p>
+    <w:p>
+      <w:r>
+        <w:t xml:space="preserve">Every meaningful state-changing operation must produce an authoritative audit/history trail. The canonical audit path must identify actor, action, resource type, resource identifier where applicable, timestamp, result/context, and metadata. Where a mutation changes business state, before/after state or an equivalent reconstructable change representation must be preserved. Reason, provenance, evidence, request/correlation identity, IP address, and user agent are captured where applicable and available.</w:t>
+      </w:r>
+    </w:p>
+    <w:p>
+      <w:pPr>
+        <w:pStyle w:val="Heading2"/>
+      </w:pPr>
+      <w:r>
+        <w:t xml:space="preserve">Integrity requirements</w:t>
+      </w:r>
+    </w:p>
+    <w:p>
+      <w:r>
+        <w:t xml:space="preserve">- Audit records are append-only and must not be silently edited or deleted through normal application flows.</w:t>
+      </w:r>
+    </w:p>
+    <w:p>
+      <w:r>
+        <w:t xml:space="preserve">- Business mutation and its audit event must be committed atomically whenever they belong to the same transaction.</w:t>
+      </w:r>
+    </w:p>
+    <w:p>
+      <w:r>
+        <w:t xml:space="preserve">- Technical Audit remains distinct from Record History, Provenance, Resource Relationship History, Resource Movement History, and Lineage. These layers may reference one another but must not become competing history engines.</w:t>
+      </w:r>
+    </w:p>
+    <w:p>
+      <w:r>
+        <w:t xml:space="preserve">- Deletion, archive, restore, transfer, correction, reversal, merge, split, ownership change, authorization-sensitive administration, and other consequential actions must remain historically reconstructable.</w:t>
+      </w:r>
+    </w:p>
+    <w:p>
+      <w:r>
+        <w:t xml:space="preserve">- Audit access is authorization-aware; privileged visibility must use the canonical AuthorizationService and must not expose sensitive history indiscriminately.</w:t>
+      </w:r>
+    </w:p>
+    <w:p>
+      <w:r>
+        <w:t xml:space="preserve">- Coverage must be verified across every mutation-capable module and future module through a repeatable audit-coverage test/checklist before production release.</w:t>
+      </w:r>
+    </w:p>
+    <w:p>
+      <w:pPr>
+        <w:pStyle w:val="Heading2"/>
+      </w:pPr>
+      <w:r>
+        <w:t xml:space="preserve">Implementation gate</w:t>
+      </w:r>
+    </w:p>
+    <w:p>
+      <w:r>
+        <w:t xml:space="preserve">Current implementation contains a centralized AuditService, transaction-safe audit creation, UserHistory versioning, and module-specific audit integrations. This is a foundation, not proof of universal coverage. The next audit/history hardening pass must inventory every mutation path, close missing audit paths, enforce consistent payload semantics, test rollback/atomicity, and verify immutability and authorization before marking this requirement complete.</w:t>
+      </w:r>
+    </w:p>
+    <w:p>
+      <w:pPr>
+        <w:pStyle w:val="Heading2"/>
+      </w:pPr>
+      <w:r>
+        <w:t xml:space="preserve">Frontend contract</w:t>
+      </w:r>
+    </w:p>
+    <w:p>
+      <w:r>
+        <w:t xml:space="preserve">Frontend History, Activity, Timeline, Super Admin audit, resource history, and user history screens must consume canonical backend history APIs. Frontend-only logs are not authoritative audit records and must never substitute for server-side audit history.</w:t>
+      </w:r>
+    </w:p>
   </w:body>
 </w:document>
 </file>

</xml_diff>

<commit_message>
Define God Mode authoritative administration architecture
</commit_message>
<xml_diff>
--- a/Absolutely KK PMD.docx
+++ b/Absolutely KK PMD.docx
@@ -12189,6 +12189,46 @@
     <w:p>
       <w:r>
         <w:t>The frontend now has a canonical route registry and direct-route audience guard, plus a typed ApiError in the shared request layer carrying HTTP status and payload. Existing Registry / Field Policy, theme, visual-effects, Activity / History, and platform administration foundations remain the canonical frontend seams.</w:t>
+      </w:r>
+    </w:p>
+    <w:p>
+      <w:r>
+        <w:t>God Mode — Authoritative Administration Control Plane</w:t>
+      </w:r>
+    </w:p>
+    <w:p>
+      <w:r>
+        <w:t>Architecture baseline: 2026-10-04. Canonical detailed architecture: docs/GOD-MODE-ARCHITECTURE.md. God Mode is the authoritative administrative root for KrishiKendram and must control rather than merely display system truth.</w:t>
+      </w:r>
+    </w:p>
+    <w:p>
+      <w:r>
+        <w:t>Governed domains</w:t>
+      </w:r>
+    </w:p>
+    <w:p>
+      <w:r>
+        <w:t>System Truth &amp; Configuration; Runtime &amp; Application; Database &amp; Connections; Docker / Infrastructure; Modules &amp; Registry; Resources &amp; Capabilities; Fields &amp; Validation; Roles &amp; Authorization; Users &amp; Lifecycle; Navigation; Themes; Feature Flags; Security; Approval Workflows; Credentials; Audit &amp; History; Snapshots &amp; Recovery; Routes/API Diagnostics; System Diagnostics; Dependency Graph.</w:t>
+      </w:r>
+    </w:p>
+    <w:p>
+      <w:r>
+        <w:t>Authority and safety contract</w:t>
+      </w:r>
+    </w:p>
+    <w:p>
+      <w:r>
+        <w:t>God defines delegated Super Admin, Admin and Cluster Head capabilities. Backend authorization remains authoritative. Significant changes follow validate → dependency analysis → snapshot → apply → health-check → audit. Recovery is reversible. Canonical repository: /home/jj/Dev/KrishiKendram. D:\Dev\KrishiKendram is not an active source tree. Root Node credential artifacts are rootnodepass.txt and rootnodepass.kkt under backend/config/god-mode/ and values remain outside Git.</w:t>
+      </w:r>
+    </w:p>
+    <w:p>
+      <w:r>
+        <w:t>Implementation principle</w:t>
+      </w:r>
+    </w:p>
+    <w:p>
+      <w:r>
+        <w:t>Future platform administration should be exposed through the canonical God Configuration Registry so required administrative changes do not require source-code editing or scattered backend modifications.</w:t>
       </w:r>
     </w:p>
     <w:p>

</xml_diff>

<commit_message>
Integrate governed AI platform and voice agent
</commit_message>
<xml_diff>
--- a/Absolutely KK PMD.docx
+++ b/Absolutely KK PMD.docx
@@ -12050,192 +12050,267 @@
       </w:r>
     </w:p>
     <w:p ns2:paraId="553C3F50" ns2:textId="77777777"/>
+    <w:p>
+      <w:pPr>
+        <w:pStyle w:val="Heading1"/>
+      </w:pPr>
+      <w:r>
+        <w:t>AI PLATFORM CONTROL PLANE — CANONICAL REGISTRY AND CENTRAL FILE GOVERNANCE</w:t>
+      </w:r>
+    </w:p>
+    <w:p>
+      <w:r>
+        <w:t>Status: first read-only AI control-plane slice verified. Backend build and focused AI tests (12/12) pass; frontend production build passes; API/UI health return HTTP 200; protected inventory route is registered; eight AI governance domains are seeded. Governed file editing remains the next implementation gate. This section extends the existing product master baseline and does not replace earlier product requirements.</w:t>
+      </w:r>
+    </w:p>
+    <w:p>
+      <w:pPr>
+        <w:pStyle w:val="Heading2"/>
+      </w:pPr>
+      <w:r>
+        <w:t>Single entrypoint and maximum reuse</w:t>
+      </w:r>
+    </w:p>
+    <w:p>
+      <w:r>
+        <w:t>KrishiKendram shall maintain one canonical AI control-plane entrypoint at ai/registry/ai-platform-registry.json (KK-AI-REGISTRY-001). Its application-wide path is registered in backend/config/resource-paths.json. Shared capabilities, context and conversation policies, provider safety constraints, provenance, confirmation, audit requirements and God Mode governance are defined once and reused; module code must not create competing AI registries or copy shared rules.</w:t>
+      </w:r>
+    </w:p>
+    <w:p>
+      <w:pPr>
+        <w:pStyle w:val="Heading2"/>
+      </w:pPr>
+      <w:r>
+        <w:t>Centrally stored module contracts</w:t>
+      </w:r>
+    </w:p>
+    <w:p>
+      <w:r>
+        <w:t>Module-specific contracts are stored centrally under ai/modules/ and linked by stable module ID from the root manifest. Initial contracts cover users, farms, crops, livestock and marketplace. This preserves module ownership without scattering configuration across feature folders. Backend startup validates linked files and contract identity before hydrating them for shared policy enforcement.</w:t>
+      </w:r>
+    </w:p>
+    <w:p>
+      <w:pPr>
+        <w:pStyle w:val="Heading2"/>
+      </w:pPr>
+      <w:r>
+        <w:t>Registered inventories and God Mode ownership</w:t>
+      </w:r>
+    </w:p>
+    <w:p>
+      <w:r>
+        <w:t>The root manifest links ai/providers/provider-inventory.json, ai/runtimes/runtime-inventory.json, ai/policies/ai-policy-index.json, ai/evaluations/evaluation-index.json and the governing AI documents. God Mode is the operational control surface for provider/model inventory and sources, installed/runtime paths, configuration variables and secret references, language/quality, data classification and consent, cost and scale, action permissions, approvals, health, audit, snapshots and rollback. Secrets themselves must never be stored in registry JSON.</w:t>
+      </w:r>
+    </w:p>
+    <w:p>
+      <w:pPr>
+        <w:pStyle w:val="Heading2"/>
+      </w:pPr>
+      <w:r>
+        <w:t>Safety and delivery gates</w:t>
+      </w:r>
+    </w:p>
+    <w:p>
+      <w:r>
+        <w:t>AI cannot directly write canonical database records. Proposed changes must be authorized, centrally validated, previewed and explicitly confirmed, then applied by the normal backend domain service with provenance and audit. Configuration changes must use the existing God Configuration Registry and its dependency analysis, pre-change snapshots, health checks and rollback. Registry files alone do not mean a provider is installed, connected, healthy or production-ready.</w:t>
+      </w:r>
+    </w:p>
+    <w:p>
+      <w:r>
+        <w:t>Implementation sequence: verify backend build and registry tests; expose read-only inventories and health in God Mode; implement governed editing with existing authorization/snapshot/audit/rollback; add provider discovery and runtime probes; add evaluation and cost/scale governance; integrate voice-guided validated drafts with forms; then implement authenticated cross-device conversation sessions.</w:t>
+      </w:r>
+    </w:p>
+    <w:p>
+      <w:r>
+        <w:t>Related implementation documents: docs/CTO-EXECUTION-BIBLE.md, docs/CTO-MASTER-BLUEPRINT.md, docs/CTO-ENHANCEMENT-REGISTER.md, docs/KK-AI-PLATFORM-REGISTRY.md, docs/KK-AI-CONVERSATION-AND-CONTEXT.md and docs/AI-VOICE-PLATFORM-AND-GOVERNANCE.md.</w:t>
+      </w:r>
+    </w:p>
+    <w:p>
+      <w:pPr>
+        <w:pStyle w:val="Heading1"/>
+      </w:pPr>
+      <w:r>
+        <w:t xml:space="preserve">Audit / History Integrity Amendment - 30 September 2026</w:t>
+      </w:r>
+    </w:p>
+    <w:p>
+      <w:r>
+        <w:t xml:space="preserve">This amendment supersedes any earlier statement that Audit/History coverage is complete merely because individual modules emit audit events. The platform foundation exists, but universal coverage remains an implementation gate.</w:t>
+      </w:r>
+    </w:p>
+    <w:p>
+      <w:pPr>
+        <w:pStyle w:val="Heading2"/>
+      </w:pPr>
+      <w:r>
+        <w:t xml:space="preserve">Required platform rule</w:t>
+      </w:r>
+    </w:p>
+    <w:p>
+      <w:r>
+        <w:t xml:space="preserve">Every meaningful state-changing operation must produce an authoritative audit/history trail. The canonical audit path must identify actor, action, resource type, resource identifier where applicable, timestamp, result/context, and metadata. Where a mutation changes business state, before/after state or an equivalent reconstructable change representation must be preserved. Reason, provenance, evidence, request/correlation identity, IP address, and user agent are captured where applicable and available.</w:t>
+      </w:r>
+    </w:p>
+    <w:p>
+      <w:pPr>
+        <w:pStyle w:val="Heading2"/>
+      </w:pPr>
+      <w:r>
+        <w:t xml:space="preserve">Integrity requirements</w:t>
+      </w:r>
+    </w:p>
+    <w:p>
+      <w:r>
+        <w:t xml:space="preserve">- Audit records are append-only and must not be silently edited or deleted through normal application flows.</w:t>
+      </w:r>
+    </w:p>
+    <w:p>
+      <w:r>
+        <w:t xml:space="preserve">- Business mutation and its audit event must be committed atomically whenever they belong to the same transaction.</w:t>
+      </w:r>
+    </w:p>
+    <w:p>
+      <w:r>
+        <w:t xml:space="preserve">- Technical Audit remains distinct from Record History, Provenance, Resource Relationship History, Resource Movement History, and Lineage. These layers may reference one another but must not become competing history engines.</w:t>
+      </w:r>
+    </w:p>
+    <w:p>
+      <w:r>
+        <w:t xml:space="preserve">- Deletion, archive, restore, transfer, correction, reversal, merge, split, ownership change, authorization-sensitive administration, and other consequential actions must remain historically reconstructable.</w:t>
+      </w:r>
+    </w:p>
+    <w:p>
+      <w:r>
+        <w:t xml:space="preserve">- Audit access is authorization-aware; privileged visibility must use the canonical AuthorizationService and must not expose sensitive history indiscriminately.</w:t>
+      </w:r>
+    </w:p>
+    <w:p>
+      <w:r>
+        <w:t xml:space="preserve">- Coverage must be verified across every mutation-capable module and future module through a repeatable audit-coverage test/checklist before production release.</w:t>
+      </w:r>
+    </w:p>
+    <w:p>
+      <w:pPr>
+        <w:pStyle w:val="Heading2"/>
+      </w:pPr>
+      <w:r>
+        <w:t xml:space="preserve">Implementation gate</w:t>
+      </w:r>
+    </w:p>
+    <w:p>
+      <w:r>
+        <w:t xml:space="preserve">Current implementation contains a centralized AuditService, transaction-safe audit creation, UserHistory versioning, and module-specific audit integrations. This is a foundation, not proof of universal coverage. The next audit/history hardening pass must inventory every mutation path, close missing audit paths, enforce consistent payload semantics, test rollback/atomicity, and verify immutability and authorization before marking this requirement complete.</w:t>
+      </w:r>
+    </w:p>
+    <w:p>
+      <w:pPr>
+        <w:pStyle w:val="Heading2"/>
+      </w:pPr>
+      <w:r>
+        <w:t xml:space="preserve">Frontend contract</w:t>
+      </w:r>
+    </w:p>
+    <w:p>
+      <w:pPr>
+        <w:pStyle w:val="Heading1"/>
+      </w:pPr>
+      <w:r>
+        <w:br w:type="page"/>
+        <w:t>Audit / Frontend Platform Hardening Checkpoint — 30 September 2026</w:t>
+      </w:r>
+    </w:p>
+    <w:p>
+      <w:pPr>
+        <w:pStyle w:val="Heading2"/>
+      </w:pPr>
+      <w:r>
+        <w:t>Universal Audit Coverage</w:t>
+      </w:r>
+    </w:p>
+    <w:p>
+      <w:r>
+        <w:t>The production business mutation inventory was re-run after the relationship, movement and lifecycle hardening pass. Core registered domain mutation paths now write through the canonical AuditService transaction path across authentication registration, user administration, farms, farm assets and records, crops, livestock, marketplace listings, custody, lease, transfer, split/merge, and ownership lifecycle operations.</w:t>
+      </w:r>
+    </w:p>
+    <w:p>
+      <w:r>
+        <w:t>Verification: backend regression 37 suites / 353 tests passed; backend build passed; frontend production build passed; git diff check passed.</w:t>
+      </w:r>
+    </w:p>
+    <w:p>
+      <w:r>
+        <w:t>System bootstrap permission reconciliation remains an intentional system-sync operation rather than a user business mutation. No second audit engine was introduced.</w:t>
+      </w:r>
+    </w:p>
+    <w:p>
+      <w:r>
+        <w:t>Audit status: CORE BUSINESS MUTATION COVERAGE HARDENED. Generic before/after snapshots for every ordinary field update remain an evidence-depth enhancement where existing domain history does not already provide reconstruction.</w:t>
+      </w:r>
+    </w:p>
+    <w:p>
+      <w:pPr>
+        <w:pStyle w:val="Heading2"/>
+      </w:pPr>
+      <w:r>
+        <w:t>Frontend Platform Seam</w:t>
+      </w:r>
+    </w:p>
+    <w:p>
+      <w:r>
+        <w:t>The frontend now has a canonical route registry and direct-route audience guard, plus a typed ApiError in the shared request layer carrying HTTP status and payload. Existing Registry / Field Policy, theme, visual-effects, Activity / History, and platform administration foundations remain the canonical frontend seams.</w:t>
+      </w:r>
+    </w:p>
+    <w:p>
+      <w:r>
+        <w:t>God Mode — Authoritative Administration Control Plane</w:t>
+      </w:r>
+    </w:p>
+    <w:p>
+      <w:r>
+        <w:t>Architecture baseline: 2026-10-04. Canonical detailed architecture: docs/GOD-MODE-ARCHITECTURE.md. God Mode is the authoritative administrative root for KrishiKendram and must control rather than merely display system truth.</w:t>
+      </w:r>
+    </w:p>
+    <w:p>
+      <w:r>
+        <w:t>Governed domains</w:t>
+      </w:r>
+    </w:p>
+    <w:p>
+      <w:r>
+        <w:t>System Truth &amp; Configuration; Runtime &amp; Application; Database &amp; Connections; Docker / Infrastructure; Modules &amp; Registry; Resources &amp; Capabilities; Fields &amp; Validation; Roles &amp; Authorization; Users &amp; Lifecycle; Navigation; Themes; Feature Flags; Security; Approval Workflows; Credentials; Audit &amp; History; Snapshots &amp; Recovery; Routes/API Diagnostics; System Diagnostics; Dependency Graph.</w:t>
+      </w:r>
+    </w:p>
+    <w:p>
+      <w:r>
+        <w:t>Authority and safety contract</w:t>
+      </w:r>
+    </w:p>
+    <w:p>
+      <w:r>
+        <w:t>God defines delegated Super Admin, Admin and Cluster Head capabilities. Backend authorization remains authoritative. Significant changes follow validate → dependency analysis → snapshot → apply → health-check → audit. Recovery is reversible. Canonical repository: /home/jj/Dev/KrishiKendram. D:\Dev\KrishiKendram is not an active source tree. Root Node credential artifacts are rootnodepass.txt and rootnodepass.kkt under backend/config/god-mode/ and values remain outside Git.</w:t>
+      </w:r>
+    </w:p>
+    <w:p>
+      <w:r>
+        <w:t>Implementation principle</w:t>
+      </w:r>
+    </w:p>
+    <w:p>
+      <w:r>
+        <w:t>Future platform administration should be exposed through the canonical God Configuration Registry so required administrative changes do not require source-code editing or scattered backend modifications.</w:t>
+      </w:r>
+    </w:p>
+    <w:p>
+      <w:r>
+        <w:t xml:space="preserve">Frontend History, Activity, Timeline, Super Admin audit, resource history, and user history screens must consume canonical backend history APIs. Frontend-only logs are not authoritative audit records and must never substitute for server-side audit history.</w:t>
+      </w:r>
+    </w:p>
     <w:sectPr>
       <w:pgSz w:w="11906" w:h="16838"/>
       <w:pgMar w:top="1440" w:right="1440" w:bottom="1440" w:left="1440" w:header="708" w:footer="708" w:gutter="0"/>
       <w:cols w:space="708"/>
       <w:docGrid w:linePitch="360"/>
     </w:sectPr>
-    <w:p>
-      <w:pPr>
-        <w:pStyle w:val="Heading1"/>
-      </w:pPr>
-      <w:r>
-        <w:t xml:space="preserve">Audit / History Integrity Amendment - 30 September 2026</w:t>
-      </w:r>
-    </w:p>
-    <w:p>
-      <w:r>
-        <w:t xml:space="preserve">This amendment supersedes any earlier statement that Audit/History coverage is complete merely because individual modules emit audit events. The platform foundation exists, but universal coverage remains an implementation gate.</w:t>
-      </w:r>
-    </w:p>
-    <w:p>
-      <w:pPr>
-        <w:pStyle w:val="Heading2"/>
-      </w:pPr>
-      <w:r>
-        <w:t xml:space="preserve">Required platform rule</w:t>
-      </w:r>
-    </w:p>
-    <w:p>
-      <w:r>
-        <w:t xml:space="preserve">Every meaningful state-changing operation must produce an authoritative audit/history trail. The canonical audit path must identify actor, action, resource type, resource identifier where applicable, timestamp, result/context, and metadata. Where a mutation changes business state, before/after state or an equivalent reconstructable change representation must be preserved. Reason, provenance, evidence, request/correlation identity, IP address, and user agent are captured where applicable and available.</w:t>
-      </w:r>
-    </w:p>
-    <w:p>
-      <w:pPr>
-        <w:pStyle w:val="Heading2"/>
-      </w:pPr>
-      <w:r>
-        <w:t xml:space="preserve">Integrity requirements</w:t>
-      </w:r>
-    </w:p>
-    <w:p>
-      <w:r>
-        <w:t xml:space="preserve">- Audit records are append-only and must not be silently edited or deleted through normal application flows.</w:t>
-      </w:r>
-    </w:p>
-    <w:p>
-      <w:r>
-        <w:t xml:space="preserve">- Business mutation and its audit event must be committed atomically whenever they belong to the same transaction.</w:t>
-      </w:r>
-    </w:p>
-    <w:p>
-      <w:r>
-        <w:t xml:space="preserve">- Technical Audit remains distinct from Record History, Provenance, Resource Relationship History, Resource Movement History, and Lineage. These layers may reference one another but must not become competing history engines.</w:t>
-      </w:r>
-    </w:p>
-    <w:p>
-      <w:r>
-        <w:t xml:space="preserve">- Deletion, archive, restore, transfer, correction, reversal, merge, split, ownership change, authorization-sensitive administration, and other consequential actions must remain historically reconstructable.</w:t>
-      </w:r>
-    </w:p>
-    <w:p>
-      <w:r>
-        <w:t xml:space="preserve">- Audit access is authorization-aware; privileged visibility must use the canonical AuthorizationService and must not expose sensitive history indiscriminately.</w:t>
-      </w:r>
-    </w:p>
-    <w:p>
-      <w:r>
-        <w:t xml:space="preserve">- Coverage must be verified across every mutation-capable module and future module through a repeatable audit-coverage test/checklist before production release.</w:t>
-      </w:r>
-    </w:p>
-    <w:p>
-      <w:pPr>
-        <w:pStyle w:val="Heading2"/>
-      </w:pPr>
-      <w:r>
-        <w:t xml:space="preserve">Implementation gate</w:t>
-      </w:r>
-    </w:p>
-    <w:p>
-      <w:r>
-        <w:t xml:space="preserve">Current implementation contains a centralized AuditService, transaction-safe audit creation, UserHistory versioning, and module-specific audit integrations. This is a foundation, not proof of universal coverage. The next audit/history hardening pass must inventory every mutation path, close missing audit paths, enforce consistent payload semantics, test rollback/atomicity, and verify immutability and authorization before marking this requirement complete.</w:t>
-      </w:r>
-    </w:p>
-    <w:p>
-      <w:pPr>
-        <w:pStyle w:val="Heading2"/>
-      </w:pPr>
-      <w:r>
-        <w:t xml:space="preserve">Frontend contract</w:t>
-      </w:r>
-    </w:p>
-    <w:p>
-      <w:pPr>
-        <w:pStyle w:val="Heading1"/>
-      </w:pPr>
-      <w:r>
-        <w:br w:type="page"/>
-        <w:t>Audit / Frontend Platform Hardening Checkpoint — 30 September 2026</w:t>
-      </w:r>
-    </w:p>
-    <w:p>
-      <w:pPr>
-        <w:pStyle w:val="Heading2"/>
-      </w:pPr>
-      <w:r>
-        <w:t>Universal Audit Coverage</w:t>
-      </w:r>
-    </w:p>
-    <w:p>
-      <w:r>
-        <w:t>The production business mutation inventory was re-run after the relationship, movement and lifecycle hardening pass. Core registered domain mutation paths now write through the canonical AuditService transaction path across authentication registration, user administration, farms, farm assets and records, crops, livestock, marketplace listings, custody, lease, transfer, split/merge, and ownership lifecycle operations.</w:t>
-      </w:r>
-    </w:p>
-    <w:p>
-      <w:r>
-        <w:t>Verification: backend regression 37 suites / 353 tests passed; backend build passed; frontend production build passed; git diff check passed.</w:t>
-      </w:r>
-    </w:p>
-    <w:p>
-      <w:r>
-        <w:t>System bootstrap permission reconciliation remains an intentional system-sync operation rather than a user business mutation. No second audit engine was introduced.</w:t>
-      </w:r>
-    </w:p>
-    <w:p>
-      <w:r>
-        <w:t>Audit status: CORE BUSINESS MUTATION COVERAGE HARDENED. Generic before/after snapshots for every ordinary field update remain an evidence-depth enhancement where existing domain history does not already provide reconstruction.</w:t>
-      </w:r>
-    </w:p>
-    <w:p>
-      <w:pPr>
-        <w:pStyle w:val="Heading2"/>
-      </w:pPr>
-      <w:r>
-        <w:t>Frontend Platform Seam</w:t>
-      </w:r>
-    </w:p>
-    <w:p>
-      <w:r>
-        <w:t>The frontend now has a canonical route registry and direct-route audience guard, plus a typed ApiError in the shared request layer carrying HTTP status and payload. Existing Registry / Field Policy, theme, visual-effects, Activity / History, and platform administration foundations remain the canonical frontend seams.</w:t>
-      </w:r>
-    </w:p>
-    <w:p>
-      <w:r>
-        <w:t>God Mode — Authoritative Administration Control Plane</w:t>
-      </w:r>
-    </w:p>
-    <w:p>
-      <w:r>
-        <w:t>Architecture baseline: 2026-10-04. Canonical detailed architecture: docs/GOD-MODE-ARCHITECTURE.md. God Mode is the authoritative administrative root for KrishiKendram and must control rather than merely display system truth.</w:t>
-      </w:r>
-    </w:p>
-    <w:p>
-      <w:r>
-        <w:t>Governed domains</w:t>
-      </w:r>
-    </w:p>
-    <w:p>
-      <w:r>
-        <w:t>System Truth &amp; Configuration; Runtime &amp; Application; Database &amp; Connections; Docker / Infrastructure; Modules &amp; Registry; Resources &amp; Capabilities; Fields &amp; Validation; Roles &amp; Authorization; Users &amp; Lifecycle; Navigation; Themes; Feature Flags; Security; Approval Workflows; Credentials; Audit &amp; History; Snapshots &amp; Recovery; Routes/API Diagnostics; System Diagnostics; Dependency Graph.</w:t>
-      </w:r>
-    </w:p>
-    <w:p>
-      <w:r>
-        <w:t>Authority and safety contract</w:t>
-      </w:r>
-    </w:p>
-    <w:p>
-      <w:r>
-        <w:t>God defines delegated Super Admin, Admin and Cluster Head capabilities. Backend authorization remains authoritative. Significant changes follow validate → dependency analysis → snapshot → apply → health-check → audit. Recovery is reversible. Canonical repository: /home/jj/Dev/KrishiKendram. D:\Dev\KrishiKendram is not an active source tree. Root Node credential artifacts are rootnodepass.txt and rootnodepass.kkt under backend/config/god-mode/ and values remain outside Git.</w:t>
-      </w:r>
-    </w:p>
-    <w:p>
-      <w:r>
-        <w:t>Implementation principle</w:t>
-      </w:r>
-    </w:p>
-    <w:p>
-      <w:r>
-        <w:t>Future platform administration should be exposed through the canonical God Configuration Registry so required administrative changes do not require source-code editing or scattered backend modifications.</w:t>
-      </w:r>
-    </w:p>
-    <w:p>
-      <w:r>
-        <w:t xml:space="preserve">Frontend History, Activity, Timeline, Super Admin audit, resource history, and user history screens must consume canonical backend history APIs. Frontend-only logs are not authoritative audit records and must never substitute for server-side audit history.</w:t>
-      </w:r>
-    </w:p>
   </w:body>
 </w:document>
 </file>

</xml_diff>

<commit_message>
Centralize AI voice intents and cloud governance
</commit_message>
<xml_diff>
--- a/Absolutely KK PMD.docx
+++ b/Absolutely KK PMD.docx
@@ -12303,6 +12303,210 @@
     <w:p>
       <w:r>
         <w:t xml:space="preserve">Frontend History, Activity, Timeline, Super Admin audit, resource history, and user history screens must consume canonical backend history APIs. Frontend-only logs are not authoritative audit records and must never substitute for server-side audit history.</w:t>
+      </w:r>
+    </w:p>
+    <w:p>
+      <w:bookmarkStart w:id="9981" w:name="KK-VOICE-FIRST-MERGE-20261013"/>
+      <w:bookmarkEnd w:id="9981"/>
+    </w:p>
+    <w:p>
+      <w:pPr>
+        <w:pStyle w:val="Heading1"/>
+      </w:pPr>
+      <w:r>
+        <w:t xml:space="preserve">Voice-first, multilingual, no-learning-curve Agri-OS (2026-10-13)</w:t>
+      </w:r>
+    </w:p>
+    <w:p>
+      <w:pPr>
+        <w:pStyle w:val="Normal"/>
+      </w:pPr>
+      <w:r>
+        <w:t xml:space="preserve">Decision: merge this enhancement into the Product Master Blueprint and CTO Execution Bible. The existing centralized AI registry, field policy, authorization-before-context, provenance/audit, and user-confirmation requirements remain mandatory.</w:t>
+      </w:r>
+    </w:p>
+    <w:p>
+      <w:pPr>
+        <w:pStyle w:val="Heading2"/>
+      </w:pPr>
+      <w:r>
+        <w:t xml:space="preserve">User experience goal</w:t>
+      </w:r>
+    </w:p>
+    <w:p>
+      <w:pPr>
+        <w:pStyle w:val="Normal"/>
+      </w:pPr>
+      <w:r>
+        <w:t xml:space="preserve">A user should be able to manage permitted application tasks through ordinary conversation in a supported Indian language, without needing to know module names or form terminology. The agent should remember answers within the authorized conversation, ask concise follow-up questions for missing or conflicting details, and show proposed field values in the relevant module.</w:t>
+      </w:r>
+    </w:p>
+    <w:p>
+      <w:pPr>
+        <w:pStyle w:val="Heading2"/>
+      </w:pPr>
+      <w:r>
+        <w:t xml:space="preserve">Canonical workflow</w:t>
+      </w:r>
+    </w:p>
+    <w:p>
+      <w:pPr>
+        <w:pStyle w:val="ListParagraph"/>
+      </w:pPr>
+      <w:r>
+        <w:t xml:space="preserve">1. Capture voice only after explicit microphone permission; always offer typed input, visible subtitles, stop/mute, language selection and correction. Do not claim offline processing unless verified.</w:t>
+      </w:r>
+    </w:p>
+    <w:p>
+      <w:pPr>
+        <w:pStyle w:val="ListParagraph"/>
+      </w:pPr>
+      <w:r>
+        <w:t xml:space="preserve">2. Preserve the original transcript and language metadata. Normalization, translation and extracted facts are linked derivatives with provenance; never silently replace the user’s wording.</w:t>
+      </w:r>
+    </w:p>
+    <w:p>
+      <w:pPr>
+        <w:pStyle w:val="ListParagraph"/>
+      </w:pPr>
+      <w:r>
+        <w:t xml:space="preserve">3. Resolve the user intent using the active screen/entity and a backend-authorized capability manifest. Browser phrase matching is navigation help only, not the final intent or authorization engine.</w:t>
+      </w:r>
+    </w:p>
+    <w:p>
+      <w:pPr>
+        <w:pStyle w:val="ListParagraph"/>
+      </w:pPr>
+      <w:r>
+        <w:t xml:space="preserve">4. Maintain a per-user, per-conversation draft. Map answers to the central field registry; track missing, uncertain, invalid, conflicting and corrected values. Ask only the next useful follow-up; never invent a required fact.</w:t>
+      </w:r>
+    </w:p>
+    <w:p>
+      <w:pPr>
+        <w:pStyle w:val="ListParagraph"/>
+      </w:pPr>
+      <w:r>
+        <w:t xml:space="preserve">5. Validate with central Field Policy/Registry and display a clear preview. Never silently overwrite saved values. Read back the exact target and proposed changes in the user’s language.</w:t>
+      </w:r>
+    </w:p>
+    <w:p>
+      <w:pPr>
+        <w:pStyle w:val="ListParagraph"/>
+      </w:pPr>
+      <w:r>
+        <w:t xml:space="preserve">6. Require explicit confirmation before writes, submissions, publishing, approvals, permission changes or high-impact operations. Execute through normal authenticated module APIs; backend repeats role, ownership, field and business-policy checks.</w:t>
+      </w:r>
+    </w:p>
+    <w:p>
+      <w:pPr>
+        <w:pStyle w:val="ListParagraph"/>
+      </w:pPr>
+      <w:r>
+        <w:t xml:space="preserve">7. Report success/failure and remaining work. Audit provider/model version, source message, extracted field references, validation, confirmation, result and rollback reference. Raw audio retention and raw conversation training are off by default.</w:t>
+      </w:r>
+    </w:p>
+    <w:p>
+      <w:pPr>
+        <w:pStyle w:val="Heading2"/>
+      </w:pPr>
+      <w:r>
+        <w:t xml:space="preserve">Role alignment and security</w:t>
+      </w:r>
+    </w:p>
+    <w:p>
+      <w:pPr>
+        <w:pStyle w:val="Normal"/>
+      </w:pPr>
+      <w:r>
+        <w:t xml:space="preserve">The existing VoiceAgent has a SUPER_ADMIN branch and hard-coded FARM/ADMIN phrase-to-route arrays. These are Phase 1 navigation helpers, not the final role policy. Replace them with a backend-authorized capability manifest and stable registered intent IDs. Voice, accent, phrase match or speaker identity never grants permissions. God Mode operations retain separate server-side authorization and high-risk confirmation.</w:t>
+      </w:r>
+    </w:p>
+    <w:p>
+      <w:pPr>
+        <w:pStyle w:val="Heading2"/>
+      </w:pPr>
+      <w:r>
+        <w:t xml:space="preserve">Free/open-source supporting stack</w:t>
+      </w:r>
+    </w:p>
+    <w:p>
+      <w:pPr>
+        <w:pStyle w:val="Normal"/>
+      </w:pPr>
+      <w:r>
+        <w:t xml:space="preserve">Canonical candidate inventory: ai/supporting-components.json, linked from ai/registry/ai-platform-registry.json. Candidate stack: Ollama plus a small quantized local LLM; whisper.cpp as CPU-first multilingual ASR baseline; AI4Bharat IndicConformerASR as a specialist comparison; AI4Bharat Indic-TTS for Indic-language speech; IndicTrans2 as optional local translation. IndicF5 and FFmpeg are deferred pending resource, need and license checks. Browser Web Speech API is a fallback only and is not guaranteed offline or private.</w:t>
+      </w:r>
+    </w:p>
+    <w:p>
+      <w:pPr>
+        <w:pStyle w:val="Normal"/>
+      </w:pPr>
+      <w:r>
+        <w:t xml:space="preserve">Host snapshot: Intel Core i3-5005U, 2 cores/4 threads, about 12 GiB RAM, Intel HD Graphics 5500, about 5.7 GiB WSL-visible memory and about 95.6 GiB free on D:. Prefer CPU-first small components; do not install heavyweight NeMo/PyTorch dependencies until measured need and capacity justify them.</w:t>
+      </w:r>
+    </w:p>
+    <w:p>
+      <w:pPr>
+        <w:pStyle w:val="Normal"/>
+      </w:pPr>
+      <w:r>
+        <w:t xml:space="preserve">Open-source/free-only means checking code, exact model/checkpoint, dataset, voice and dependency licenses separately. No paid or credit-metered API, implicit cloud fallback, or claim of offline speech is permitted by default. Candidate status does not mean installed or production-ready.</w:t>
+      </w:r>
+    </w:p>
+    <w:p>
+      <w:pPr>
+        <w:pStyle w:val="Heading2"/>
+      </w:pPr>
+      <w:r>
+        <w:t xml:space="preserve">Acceptance gates</w:t>
+      </w:r>
+    </w:p>
+    <w:p>
+      <w:pPr>
+        <w:pStyle w:val="ListParagraph"/>
+      </w:pPr>
+      <w:r>
+        <w:t xml:space="preserve">1. Verify official source, pinned version, checksum/signature, exact licenses and rollback path.</w:t>
+      </w:r>
+    </w:p>
+    <w:p>
+      <w:pPr>
+        <w:pStyle w:val="ListParagraph"/>
+      </w:pPr>
+      <w:r>
+        <w:t xml:space="preserve">2. Measure cold/warm latency, first-token/first-audio time, real-time factor, peak RAM, CPU, disk, concurrency and impact on app/PostgreSQL/Docker.</w:t>
+      </w:r>
+    </w:p>
+    <w:p>
+      <w:pPr>
+        <w:pStyle w:val="ListParagraph"/>
+      </w:pPr>
+      <w:r>
+        <w:t xml:space="preserve">3. Run consented Telugu-first and then Hindi/additional-language benchmarks with native-speaker review: dialects, code-mixing, farm vocabulary, names, numbers/units and noisy audio.</w:t>
+      </w:r>
+    </w:p>
+    <w:p>
+      <w:pPr>
+        <w:pStyle w:val="ListParagraph"/>
+      </w:pPr>
+      <w:r>
+        <w:t xml:space="preserve">4. Test multi-turn form completion for profile/onboarding, farms, crops/crop cycles, livestock, activities and marketplace, including correction, conflict detection, validation, preview, confirmation, normal API submission, audit and rollback.</w:t>
+      </w:r>
+    </w:p>
+    <w:p>
+      <w:pPr>
+        <w:pStyle w:val="ListParagraph"/>
+      </w:pPr>
+      <w:r>
+        <w:t xml:space="preserve">5. Test cross-role/cross-owner denial, prompt injection, allowlisted tools, exact-preview confirmation, idempotency, rate limits, timeouts, retention/deletion and accessibility.</w:t>
+      </w:r>
+    </w:p>
+    <w:p>
+      <w:pPr>
+        <w:pStyle w:val="Normal"/>
+      </w:pPr>
+      <w:r>
+        <w:t xml:space="preserve">No runtime/model was installed or downloaded in this documentation checkpoint. The incomplete unverified Ollama installer was removed. The LLM provider remains disabled and ASR remains a placeholder until separately implemented, benchmarked and approved.</w:t>
       </w:r>
     </w:p>
     <w:sectPr>

</xml_diff>

<commit_message>
Implement governed local AI provider and voice integration
</commit_message>
<xml_diff>
--- a/Absolutely KK PMD.docx
+++ b/Absolutely KK PMD.docx
@@ -12507,6 +12507,86 @@
       </w:pPr>
       <w:r>
         <w:t xml:space="preserve">No runtime/model was installed or downloaded in this documentation checkpoint. The incomplete unverified Ollama installer was removed. The LLM provider remains disabled and ASR remains a placeholder until separately implemented, benchmarked and approved.</w:t>
+      </w:r>
+    </w:p>
+    <w:p>
+      <w:pPr>
+        <w:pStyle w:val="Heading1"/>
+      </w:pPr>
+      <w:r>
+        <w:t xml:space="preserve">AI Runtime and Governed Conversation Update — 14 October 2026</w:t>
+      </w:r>
+    </w:p>
+    <w:p>
+      <w:pPr>
+        <w:pStyle w:val="Normal"/>
+      </w:pPr>
+      <w:r>
+        <w:t xml:space="preserve">Status: PARTIAL — a local model and provider adapter are operationally verified for synthetic English and Telugu inference; the complete authenticated application workflow and all module write handlers are not yet accepted.</w:t>
+      </w:r>
+    </w:p>
+    <w:p>
+      <w:pPr>
+        <w:pStyle w:val="Heading2"/>
+      </w:pPr>
+      <w:r>
+        <w:t xml:space="preserve">Verified local model evaluation</w:t>
+      </w:r>
+    </w:p>
+    <w:p>
+      <w:pPr>
+        <w:pStyle w:val="Normal"/>
+      </w:pPr>
+      <w:r>
+        <w:t xml:space="preserve">Ollama 0.40.3 is installed under D:/KrishiKendram/08-AI/Tools/Ollama. Qwen3 1.7B Q4_K_M is installed in the registered D: model directory with digest 8f68893c685c3ddff2aa3fffce2aa60a30bb2da65ca488b61fff134a4d1730e7. The runtime binds to 127.0.0.1:11434 and OLLAMA_NO_CLOUD=true; no cloud fallback is allowed.</w:t>
+      </w:r>
+    </w:p>
+    <w:p>
+      <w:pPr>
+        <w:pStyle w:val="Normal"/>
+      </w:pPr>
+      <w:r>
+        <w:t xml:space="preserve">The compiled local provider adapter returned synthetic English output in 6.1 seconds warm and synthetic Telugu output in 29.9 seconds warm. Model health is checked before generation, and generated provenance uses the observed installed model digest rather than UNVERIFIED_LOCAL_MODEL. These results are evaluation evidence, not a native-speaker quality benchmark or production approval.</w:t>
+      </w:r>
+    </w:p>
+    <w:p>
+      <w:pPr>
+        <w:pStyle w:val="Heading2"/>
+      </w:pPr>
+      <w:r>
+        <w:t xml:space="preserve">Governance and module acceptance</w:t>
+      </w:r>
+    </w:p>
+    <w:p>
+      <w:pPr>
+        <w:pStyle w:val="Normal"/>
+      </w:pPr>
+      <w:r>
+        <w:t xml:space="preserve">The canonical provider inventory remains EVALUATION_IN_PROGRESS, productionReady=false, and evaluation-only. Generation requires explicit KK_AI_ALLOW_LOCAL_EVALUATION=true outside production. Provider unavailability, missing model, malformed output and timeouts fail closed; cloud fallback remains disabled.</w:t>
+      </w:r>
+    </w:p>
+    <w:p>
+      <w:pPr>
+        <w:pStyle w:val="Normal"/>
+      </w:pPr>
+      <w:r>
+        <w:t xml:space="preserve">The shared fact-draft lifecycle supports central field validation, exact-preview hashing, explicit confirmation/rejection, authorization rechecks and transactional audit. The current apply handler supports only the authenticated user's own allowlisted profile fields through UsersService.update. Farm, Crop, Livestock and Marketplace drafts must remain unapplied until module-owned handlers can aggregate complete required fields and call their normal authorized services. Direct AI database writes remain prohibited.</w:t>
+      </w:r>
+    </w:p>
+    <w:p>
+      <w:pPr>
+        <w:pStyle w:val="Normal"/>
+      </w:pPr>
+      <w:r>
+        <w:t xml:space="preserve">Voice input is still capability-dependent browser speech; the registered IndicConformer ASR implementation remains a placeholder. Do not claim offline voice, production-ready multilingual AI, or COMPLETE module status until authenticated end-to-end tests cover preview, correction, confirmation, normal API mutation, audit/history and denial paths.</w:t>
+      </w:r>
+    </w:p>
+    <w:p>
+      <w:pPr>
+        <w:pStyle w:val="Normal"/>
+      </w:pPr>
+      <w:r>
+        <w:t xml:space="preserve">Next acceptance sequence: finish and record synthetic Telugu output; verify provider digest/provenance tests and all builds; implement a reusable multi-field draft/application contract through existing module services; prove one authenticated database-backed workflow; then extend and verify each registered module without bypassing ABC C → B → A promotion.</w:t>
       </w:r>
     </w:p>
     <w:sectPr>

</xml_diff>

<commit_message>
Implement governed transactional AI draft apply handlers
</commit_message>
<xml_diff>
--- a/Absolutely KK PMD.docx
+++ b/Absolutely KK PMD.docx
@@ -12587,6 +12587,54 @@
       </w:pPr>
       <w:r>
         <w:t xml:space="preserve">Next acceptance sequence: finish and record synthetic Telugu output; verify provider digest/provenance tests and all builds; implement a reusable multi-field draft/application contract through existing module services; prove one authenticated database-backed workflow; then extend and verify each registered module without bypassing ABC C → B → A promotion.</w:t>
+      </w:r>
+    </w:p>
+    <w:p>
+      <w:pPr>
+        <w:pStyle w:val="Heading1"/>
+      </w:pPr>
+      <w:r>
+        <w:t xml:space="preserve">2026-10-14 - Governed AI Existing-Record Application Addendum</w:t>
+      </w:r>
+    </w:p>
+    <w:p>
+      <w:r>
+        <w:t xml:space="preserve">Status: PARTIAL. Existing-record single-field updates are implemented for registered targets; multi-field creation and authenticated database-backed end-to-end acceptance remain open.</w:t>
+      </w:r>
+    </w:p>
+    <w:p>
+      <w:r>
+        <w:t xml:space="preserve">- Canonical module contracts own applyFields allowlists, linked from the root AI registry and checked against platform resource fields.</w:t>
+      </w:r>
+    </w:p>
+    <w:p>
+      <w:r>
+        <w:t xml:space="preserve">- Resource and field authorization precede reading the protected previous field value. Normal module update services retain validation and ownership enforcement.</w:t>
+      </w:r>
+    </w:p>
+    <w:p>
+      <w:r>
+        <w:t xml:space="preserve">- AI application locks the target row, rejects stale previews, conditionally transitions CONFIRMED to APPLIED, and records module and AI audit events in one transaction.</w:t>
+      </w:r>
+    </w:p>
+    <w:p>
+      <w:r>
+        <w:t xml:space="preserve">- Super Admin business-record AI writes require a canonical GOD_MODE authorization decision. Ordinary SUPER_ADMIN role membership is not sufficient; Super Admin self-profile draft creation remains fail-closed.</w:t>
+      </w:r>
+    </w:p>
+    <w:p>
+      <w:r>
+        <w:t xml:space="preserve">- Crop application is limited to name because that is currently the only field registered in the central Crop resource. New-record multi-field creation and FarmAsset/FarmRecord apply handlers remain open.</w:t>
+      </w:r>
+    </w:p>
+    <w:p>
+      <w:r>
+        <w:t xml:space="preserve">- Verification: backend production build PASS; full backend regression 53 suites / 500 tests PASS; frontend production build PASS; focused AI authorization and registry tests PASS; API and UI health endpoints HTTP 200.</w:t>
+      </w:r>
+    </w:p>
+    <w:p>
+      <w:r>
+        <w:t xml:space="preserve">- Local model production approval is not granted. Indic-language quality, safety, concurrency, and authenticated database-backed end-to-end acceptance remain open.</w:t>
       </w:r>
     </w:p>
     <w:sectPr>

</xml_diff>

<commit_message>
Complete governed Marketplace and core module workflows
</commit_message>
<xml_diff>
--- a/Absolutely KK PMD.docx
+++ b/Absolutely KK PMD.docx
@@ -12635,6 +12635,699 @@
     <w:p>
       <w:r>
         <w:t xml:space="preserve">- Local model production approval is not granted. Indic-language quality, safety, concurrency, and authenticated database-backed end-to-end acceptance remain open.</w:t>
+      </w:r>
+    </w:p>
+    <w:p>
+      <w:pPr>
+        <w:pStyle w:val="Normal"/>
+      </w:pPr>
+      <w:r>
+        <w:t xml:space="preserve">Local multilingual Intake translation: The authenticated local translation endpoint uses the governed local model only. It preserves the original transcript, returns an English meaning with an uncalibrated confidence estimate and review notes, flags numeric, measurement-unit, and planting-action drift, and requires explicit farmer review and confirmation before Intake processing. The model remains evaluation-only; language quality and latency benchmarks are pending.</w:t>
+      </w:r>
+    </w:p>
+    <w:p>
+      <w:pPr>
+        <w:pStyle w:val="Heading1"/>
+      </w:pPr>
+      <w:r>
+        <w:t xml:space="preserve">2026-10-17 - Registry-first Module Governance and Inclusive Marketplace</w:t>
+      </w:r>
+    </w:p>
+    <w:p>
+      <w:r>
+        <w:t xml:space="preserve">Central Registry contract: every module field, validation rule, option/category list and configurable workflow must be defined centrally and consumed by all UI and backend write paths, including API, import, voice, image and AI flows. DTO checks may provide early transport rejection but must not become a second business-rule source.</w:t>
+      </w:r>
+    </w:p>
+    <w:p>
+      <w:r>
+        <w:t xml:space="preserve">Administration parity: God Mode remains the ultimate platform governance surface. Super Admin must have the complete authorized operational set for approvals, module configuration, validation policy, implementation and upgrades. Admin receives explicitly delegated capabilities. Sensitive actions require server-side capability enforcement, audit evidence, separation of duties, dependency checks and recovery gates. Module detach/upgrade must preserve historical data and must not silently delete records.</w:t>
+      </w:r>
+    </w:p>
+    <w:p>
+      <w:r>
+        <w:t xml:space="preserve">Inclusive profiles: marketplace sellers must be registered users, but basic farmer participation must not require email, formal business registration or digital-literacy prerequisites. Support optional individual, farmer, FPO, cooperative, business, trader, service provider and buyer profiles with optional public display name, organization, biography, photo, languages, location and contact preferences. Never expose private contact fields by default.</w:t>
+      </w:r>
+    </w:p>
+    <w:p>
+      <w:r>
+        <w:t xml:space="preserve">Marketplace: listings may use a generic name and may be independent of a registered crop/livestock/farm asset; linked resources must still pass ownership and authorization checks. Categories/options come from Registry. Browsing supports newest/today, yesterday, day before yesterday, week-wise and currently active listings. Support persistent validated photos, seller attribution and optional, explicit privacy-safe sharing of crop/livestock lifecycle information. Clearly distinguish seller claims from verified records.</w:t>
+      </w:r>
+    </w:p>
+    <w:p>
+      <w:r>
+        <w:t xml:space="preserve">Acceptance gates: verify Admin/Super Admin/God Mode approval parity against one capability matrix; registry-driven field and category validation; non-destructive module lifecycle changes; image upload/storage validation; privacy-safe profile/lifecycle sharing; and automated authorization, migration, backend, frontend and browser tests.</w:t>
+      </w:r>
+    </w:p>
+    <w:p>
+      <w:r>
+        <w:t>2026-10-17 - Marketplace Commerce Expansion</w:t>
+      </w:r>
+    </w:p>
+    <w:p>
+      <w:r>
+        <w:t>Marketplace is a multi-sided agriculture commerce workflow with dedicated buyer and seller workspaces, listing lifecycle and sold history, per-unit and bulk pricing, buyer offers and agreed prices, media links, order fulfilment, payment-provider adapters, seller reputation and privacy-safe traceability.</w:t>
+      </w:r>
+    </w:p>
+    <w:p>
+      <w:r>
+        <w:t>Seller workspace: create/edit/draft/publish/pause/archive listings; availability; unit and bulk prices; minimum order quantity; offers received; order processing; sold/completed history and sales summaries.</w:t>
+      </w:r>
+    </w:p>
+    <w:p>
+      <w:r>
+        <w:t>Buyer workspace: discover/search/filter, compare and save listings, request quotes, place quantity orders, submit price offers, track orders, message sellers, review completed transactions and report disputes.</w:t>
+      </w:r>
+    </w:p>
+    <w:p>
+      <w:r>
+        <w:t>Negotiation must retain original listing price, buyer offer, agreed price, actor and timestamps separately. Counteroffers require an explicit permission-checked state machine, expiry and audit history.</w:t>
+      </w:r>
+    </w:p>
+    <w:p>
+      <w:r>
+        <w:t>Rich listings may contain multiple photos, video URLs and external social/catalogue/Drive links. Validate URLs and use safe outbound links. Embed only official/publicly embeddable content. Do not bypass Drive permissions or scrape private content.</w:t>
+      </w:r>
+    </w:p>
+    <w:p>
+      <w:r>
+        <w:t>Future commerce scope: pickup/delivery options, shipment tracking, receipts, cancellation/returns/disputes, payment adapters, seller settlement reconciliation, favourites, reviews, RFQ/wholesale, FPO/co-op pooled supply and recurring orders.</w:t>
+      </w:r>
+    </w:p>
+    <w:p>
+      <w:r>
+        <w:t>Agriculture-native listing fields include harvest/batch availability, grade, variety, quantity available now versus later, origin evidence, equipment rental and farm services.</w:t>
+      </w:r>
+    </w:p>
+    <w:p>
+      <w:r>
+        <w:t>Media storage must use a storage adapter with durable object storage for deployment, generated object keys, metadata in the database, upload size/type limits and content scanning. Do not store large media as base64 in database rows.</w:t>
+      </w:r>
+    </w:p>
+    <w:p>
+      <w:r>
+        <w:t>AI roadmap: local/provider-agnostic voice/photo/video listing drafts; automatic language detection and translation; quantity/unit/grade extraction with confidence and seller confirmation; advisory price suggestions with source/region/time; buyer-seller matching; RFQ summarization; spam/fraud/duplicate signals with human review.</w:t>
+      </w:r>
+    </w:p>
+    <w:p>
+      <w:r>
+        <w:t>AI must not autonomously publish listings, set prices, accept offers, transact, or share private farm/crop/livestock history. Seller confirmation and consent remain mandatory.</w:t>
+      </w:r>
+    </w:p>
+    <w:p>
+      <w:r>
+        <w:t>Architecture guardrail: keep the existing NestJS/Prisma Registry, authorization and audit system authoritative. Evaluate MercurJS/Medusa marketplace patterns at https://github.com/mercurjs/mercur and OpenShip conversational-commerce patterns at https://github.com/openshiporg/marketplace; do not introduce a parallel source of truth without an explicit compatibility and migration review.</w:t>
+      </w:r>
+    </w:p>
+    <w:p>
+      <w:r>
+        <w:t>2026-10-17 - Marketplace Fees, Taxes, Trust and Admin Feature Control</w:t>
+      </w:r>
+    </w:p>
+    <w:p>
+      <w:r>
+        <w:t>Before a buyer commits, the checkout quote must itemize the buyer platform fee, seller commission, applicable tax lines, shipping/payment charges, discounts, buyer total, seller gross, deductions and seller net. Rates and tax obligations must be jurisdiction/product/category-aware and reviewed by qualified tax/legal advisers; never hardcode a tax rate as a legal fact.</w:t>
+      </w:r>
+    </w:p>
+    <w:p>
+      <w:r>
+        <w:t>Each transaction must retain an immutable versioned fee/tax calculation snapshot, quote expiry, currency and rounding policy. Financial ledger amounts require decimal-safe arithmetic. Policy changes must not alter completed historical transactions.</w:t>
+      </w:r>
+    </w:p>
+    <w:p>
+      <w:r>
+        <w:t>Payment collection and deductions require an approved payment-provider adapter, signed webhook verification, idempotency, reconciliation, refund/credit-note handling, payout states and failure/retry tests. Do not store raw payment credentials.</w:t>
+      </w:r>
+    </w:p>
+    <w:p>
+      <w:r>
+        <w:t>Buyer workspace must show complete purchase history, order state, receipts, complaints, refunds and repeat orders. Seller workspace must show order/sold history, buyer offers, gross sales, fees, taxes/withholding where applicable, refunds, net settlement and statements. Each party can only access authorized records.</w:t>
+      </w:r>
+    </w:p>
+    <w:p>
+      <w:r>
+        <w:t>Add mutual buyer/seller comments and ratings tied to verified completed transactions; private dispute evidence; reports, responses, moderation and appeals. Caution indicators and blacklist restrictions must be scoped, evidence-backed, time-bounded/reviewable, audited and appealable. AI risk signals cannot permanently blacklist a person autonomously.</w:t>
+      </w:r>
+    </w:p>
+    <w:p>
+      <w:r>
+        <w:t>Admin, Super Admin and God Mode require one Registry-backed feature catalogue with server-enforced permissions, dependency checks, versioned changes, effective dates, audit and rollback. Admin operates delegated workflows; Super Admin controls marketplace commercial policy and escalations; God Mode retains ultimate override and all operational approvals. Disabling a feature must preserve historical records, refunds and audit.</w:t>
+      </w:r>
+    </w:p>
+    <w:p>
+      <w:r>
+        <w:t>Maintain continuous evaluation of open-source commerce, payment/tax adapters, storage, social APIs, identity, fraud tooling, market-price feeds and local AI against license, security, self-hosting, data residency, cost, maintenance, lock-in, low-bandwidth and farmer usability. Detailed acceptance criteria are in docs/MARKETPLACE-COMMERCE-GOVERNANCE-ROADMAP.md.</w:t>
+      </w:r>
+    </w:p>
+    <w:p>
+      <w:r>
+        <w:t>Release gate: financial policy and immutable quote/ledger; payment sandbox and reconciliation; buyer/seller history; reviews and appealable trust actions; Admin/Super Admin/God Mode capability matrix; end-to-end checkout-to-refund/dispute tests; qualified tax/legal review. Requirements documentation alone does not mean these features are implemented.</w:t>
+      </w:r>
+    </w:p>
+    <w:p>
+      <w:pPr>
+        <w:pStyle w:val="H1"/>
+      </w:pPr>
+      <w:r>
+        <w:t>Marketplace Commerce, Trust, Financial Controls and Feature Governance — 2026-10-18</w:t>
+      </w:r>
+    </w:p>
+    <w:p>
+      <w:r>
+        <w:t>Updated: 2026-10-17 23:51:39 IST</w:t>
+      </w:r>
+    </w:p>
+    <w:p>
+      <w:pPr>
+        <w:pStyle w:val="H2"/>
+      </w:pPr>
+      <w:r>
+        <w:t>Product objective</w:t>
+      </w:r>
+    </w:p>
+    <w:p>
+      <w:r>
+        <w:t>Marketplace is a governed agricultural commerce workflow, not merely a listings page. It supports discovery, offers, transparent deal terms, fulfilment, transaction history, reviews, disputes, trust decisions and eventual payment/settlement. Each capability is independently feature-controlled without erasing historical records.</w:t>
+      </w:r>
+    </w:p>
+    <w:p>
+      <w:pPr>
+        <w:pStyle w:val="H2"/>
+      </w:pPr>
+      <w:r>
+        <w:t>1. Listing-to-deal flow</w:t>
+      </w:r>
+    </w:p>
+    <w:p>
+      <w:r>
+        <w:t>Seller creates a generic or resource-linked listing; Registry validates fields; ownership, authorization and restrictions are checked; seller publishes; buyer browses and requests a quote; quote snapshots quantity, unit price, buyer fee, seller commission, tax status, buyer total, estimated seller net, currency and policy version; buyer submits order; seller accepts/rejects/proposes another price; changed price requires buyer confirmation; parties fulfil; completion updates tracked stock atomically; both parties can submit a verified review; history is retained.</w:t>
+      </w:r>
+    </w:p>
+    <w:p>
+      <w:pPr>
+        <w:pStyle w:val="H2"/>
+      </w:pPr>
+      <w:r>
+        <w:t>2. Fee and tax policy</w:t>
+      </w:r>
+    </w:p>
+    <w:p>
+      <w:r>
+        <w:t>Buyer platform fee and seller commission are separate, configurable, versioned basis-point policies. Show subtotal, buyer fee, tax, configured shipping/payment costs, discounts, buyer payable total, seller gross, commission, seller net estimate, currency, rounding and quote time/expiry. Never invent statutory rates. Tax must eventually be jurisdiction/product/category/seller-type aware with effective dates, exemptions, invoice/credit-note references and qualified review. Until reviewed configuration exists, mark REVIEW_REQUIRED and keep the quote provisional; collect no money.</w:t>
+      </w:r>
+    </w:p>
+    <w:p>
+      <w:pPr>
+        <w:pStyle w:val="H2"/>
+      </w:pPr>
+      <w:r>
+        <w:t>3. Payment, ledger and settlement</w:t>
+      </w:r>
+    </w:p>
+    <w:p>
+      <w:r>
+        <w:t>After provider selection, create payment intent against an immutable order quote; verify signed webhooks; use idempotency and replay protection; post balanced immutable ledger entries; track authorization/capture/failure/refund/partial refund/chargeback/payout; reconcile provider statements; calculate settlement after disclosed fees/tax/adjustments; support payout holds and disputes. Never store raw payment credentials or claim money moved without provider and ledger evidence.</w:t>
+      </w:r>
+    </w:p>
+    <w:p>
+      <w:pPr>
+        <w:pStyle w:val="H2"/>
+      </w:pPr>
+      <w:r>
+        <w:t>4. Buyer and seller histories</w:t>
+      </w:r>
+    </w:p>
+    <w:p>
+      <w:r>
+        <w:t>Buyer view: orders, status timeline, seller, quantity, saved quote, offer/counter-offer, completion, invoices/receipts when available, refunds/disputes and review. Seller view: purchases and sales separately, listing, buyer under privacy rules, gross, commission, tax, net estimate, payment state, refunds, settlement/payout references and export. Historical quote snapshots are immutable; net is only an estimate until payment and reconciliation are live.</w:t>
+      </w:r>
+    </w:p>
+    <w:p>
+      <w:pPr>
+        <w:pStyle w:val="H2"/>
+      </w:pPr>
+      <w:r>
+        <w:t>5. Reports, evidence and dispute workflow</w:t>
+      </w:r>
+    </w:p>
+    <w:p>
+      <w:r>
+        <w:t>Buyer or seller can report listing/transaction using controlled categories (fraud, misrepresentation, non-delivery, quality, harassment, payment dispute, safety, other), description and bounded evidence links. Transaction reports require participation; derive the counterparty server-side. Flow: OPEN → UNDER_REVIEW → RESOLVED or DISMISSED. Preserve reporter, target, case, evidence references, reviewer, timestamps, rationale and audit. Private evidence never appears on public profiles. Appeals are linked cases and should be independently reviewed where feasible.</w:t>
+      </w:r>
+    </w:p>
+    <w:p>
+      <w:pPr>
+        <w:pStyle w:val="H2"/>
+      </w:pPr>
+      <w:r>
+        <w:t>6. Caution ratings and scoped restrictions</w:t>
+      </w:r>
+    </w:p>
+    <w:p>
+      <w:r>
+        <w:t>Caution is an evidence-backed risk signal, not a public accusation or automatic guilt. Separate scopes: CAUTION, LISTING_CREATE, ORDER_CREATE, MARKETPLACE_ALL. Every restriction needs reason, case/evidence, actor, start, optional expiry, status and appeal path. Expired restrictions cease to block actions; revocation is audited. Restrict only necessary Marketplace capabilities, preserve history and appeals, and never erase records. AI may flag patterns but cannot autonomously blacklist or permanently ban.</w:t>
+      </w:r>
+    </w:p>
+    <w:p>
+      <w:pPr>
+        <w:pStyle w:val="H2"/>
+      </w:pPr>
+      <w:r>
+        <w:t>7. Verified reviews and comments</w:t>
+      </w:r>
+    </w:p>
+    <w:p>
+      <w:r>
+        <w:t>Only a participant in a completed order can review the counterparty, once per order. Reviews start PENDING; only PUBLISHED reviews are public. Preserve moderation history. Seller response is bounded and auditable and cannot rewrite the review. Provide abuse/report/appeal paths and show rating context/sample size.</w:t>
+      </w:r>
+    </w:p>
+    <w:p>
+      <w:pPr>
+        <w:pStyle w:val="H2"/>
+      </w:pPr>
+      <w:r>
+        <w:t>8. Admin, Super Admin and God Mode</w:t>
+      </w:r>
+    </w:p>
+    <w:p>
+      <w:r>
+        <w:t>Admin handles assigned queues and routine cases within delegated permissions. Super Admin controls approved policy, escalations, scoped restrictions, moderation and feature configuration. God Mode has ultimate override and includes every operational approval available to Super Admin. Decisions require server authorization, actor, reason, before/after audit, effective time and safe reversibility. Do not infer God Mode from UI labels.</w:t>
+      </w:r>
+    </w:p>
+    <w:p>
+      <w:pPr>
+        <w:pStyle w:val="H2"/>
+      </w:pPr>
+      <w:r>
+        <w:t>9. Feature switchboard and dependencies</w:t>
+      </w:r>
+    </w:p>
+    <w:p>
+      <w:r>
+        <w:t>Registry-backed feature catalogue: stable ID, owner, description, default/enabled state, role scope, dependencies, risk, rollout, version, last actor/time, approval and rollback plan. Features include listings, offers, buyer fees, seller commission, tax display, payments, refunds, settlement, reviews, comments, evidence, caution, reports, restrictions, appeals, history export, verification, media links, bulk pricing, delivery, RFQ and AI. Turning a feature off must not erase orders, evidence, invoices, ledger, audit or appeal rights. Drain in-flight payment/refund flows before disabling dependencies.</w:t>
+      </w:r>
+    </w:p>
+    <w:p>
+      <w:pPr>
+        <w:pStyle w:val="H2"/>
+      </w:pPr>
+      <w:r>
+        <w:t>10. Continuous technology evaluation</w:t>
+      </w:r>
+    </w:p>
+    <w:p>
+      <w:r>
+        <w:t>Review open-source commerce engines, payment/tax adapters, object storage, identity/verification, fraud, agricultural market feeds, messaging, logistics, accessibility and low-bandwidth/offline support. Score licence, self-hosting, cost, data residency, Indian farmer usability, language support, API maturity, lock-in, maintenance, security, observability, recovery and exit strategy. Prototype behind adapters/feature flags; test failure/security; document decision, owner and date. No provider is trusted solely on an AI recommendation.</w:t>
+      </w:r>
+    </w:p>
+    <w:p>
+      <w:pPr>
+        <w:pStyle w:val="H2"/>
+      </w:pPr>
+      <w:r>
+        <w:t>11. Acceptance and safety gates</w:t>
+      </w:r>
+    </w:p>
+    <w:p>
+      <w:r>
+        <w:t>No live deduction without reviewed fee/tax policy, explicit disclosure/consent, provider integration, signed webhook verification, idempotent ledger, refund/reconciliation tests, incident playbook and legal/accounting review. No permanent blacklist without documented evidence, authorized decision, notice and appeal. Protect private evidence. Test role boundaries, counterparty verification, expiry, concurrent stock, policy versions, webhook replay, partial refunds, appeals, feature dependencies and audit completeness.</w:t>
+      </w:r>
+    </w:p>
+    <w:p>
+      <w:pPr>
+        <w:pStyle w:val="H2"/>
+      </w:pPr>
+      <w:r>
+        <w:t>12. Current implementation boundary</w:t>
+      </w:r>
+    </w:p>
+    <w:p>
+      <w:r>
+        <w:t>Implemented: versioned fee/commission policy, provisional quote breakdown, immutable quote snapshot, buyer confirmation of seller-changed price, transaction-verified reviews and moderation, trust-case/restriction persistence and endpoints, restriction checks on listing creation/publication and order creation, and buyer/seller history summary API. UI for trust queues/appeals, independent appeal review, feature switchboard integration, Registry resource definitions, media upload, provider payment, ledger, refunds and payouts remain follow-on work; never describe a planned adapter as live.</w:t>
+      </w:r>
+    </w:p>
+    <w:p>
+      <w:pPr>
+        <w:pStyle w:val="H2"/>
+      </w:pPr>
+      <w:r>
+        <w:t>End-to-end execution flow</w:t>
+      </w:r>
+    </w:p>
+    <w:p>
+      <w:r>
+        <w:t>1) Configure/review policy → 2) seller drafts/publishes after Registry, authorization and trust checks → 3) buyer requests versioned quote → 4) buyer places order → 5) seller accepts/rejects/proposes price → 6) buyer confirms changed price → 7) parties fulfil → 8) completion updates stock/order → 9) approved payment adapter captures/reconciles money → 10) histories/settlement show verified facts → 11) parties review/report → 12) authorized moderator investigates and records scoped expiring decision → 13) affected party appeals → 14) audit and metrics feed continuous evaluation.</w:t>
+      </w:r>
+    </w:p>
+    <w:p>
+      <w:pPr>
+        <w:pStyle w:val="H1"/>
+      </w:pPr>
+      <w:r>
+        <w:t>Marketplace implementation checkpoint — 2026-10-18 00:09:58 IST</w:t>
+      </w:r>
+    </w:p>
+    <w:p>
+      <w:r>
+        <w:t>H1</w:t>
+      </w:r>
+    </w:p>
+    <w:p>
+      <w:pPr>
+        <w:pStyle w:val="H2"/>
+      </w:pPr>
+      <w:r>
+        <w:t>Implemented in code</w:t>
+      </w:r>
+    </w:p>
+    <w:p>
+      <w:r>
+        <w:t>H2</w:t>
+      </w:r>
+    </w:p>
+    <w:p>
+      <w:pPr>
+        <w:pStyle w:val="H2"/>
+      </w:pPr>
+      <w:r>
+        <w:t>Commerce quote and policy</w:t>
+      </w:r>
+    </w:p>
+    <w:p>
+      <w:r>
+        <w:t>Buyer fee and seller commission are independent feature-gated quote lines. Quotes use integer minor-unit rounding, versioned policy snapshots, tax review state, buyer total and seller net estimate. A seller-proposed price change requires explicit buyer confirmation before ACCEPTED.</w:t>
+      </w:r>
+    </w:p>
+    <w:p>
+      <w:pPr>
+        <w:pStyle w:val="H2"/>
+      </w:pPr>
+      <w:r>
+        <w:t>Trust reports and appeal</w:t>
+      </w:r>
+    </w:p>
+    <w:p>
+      <w:r>
+        <w:t>Authenticated case intake supports controlled categories, bounded evidence URLs, listing/order association, server-derived transaction counterparty, case status and audit. Appeals are linked to a decided parent case; target users can see a redacted decided-case entry and appeal without exposing the reporter evidence. Appeal decisions are rejected when attempted by the original decision-maker.</w:t>
+      </w:r>
+    </w:p>
+    <w:p>
+      <w:pPr>
+        <w:pStyle w:val="H2"/>
+      </w:pPr>
+      <w:r>
+        <w:t>Caution and restrictions</w:t>
+      </w:r>
+    </w:p>
+    <w:p>
+      <w:r>
+        <w:t>Restrictions have separate CAUTION, LISTING_CREATE, ORDER_CREATE and MARKETPLACE_ALL scopes, case/evidence linkage, actor attribution and expiry. All new restrictions must expire within 1–365 days. Active restrictions are enforced at listing creation/publication and order creation; admins can review and revoke with a reason. Caution records do not automatically block transactions.</w:t>
+      </w:r>
+    </w:p>
+    <w:p>
+      <w:pPr>
+        <w:pStyle w:val="H2"/>
+      </w:pPr>
+      <w:r>
+        <w:t>Reviews and history</w:t>
+      </w:r>
+    </w:p>
+    <w:p>
+      <w:r>
+        <w:t>Only participants in completed orders can submit one review each; reviews start pending moderation. Authorized moderation is audited, and a review recipient can post a bounded, audited response after publication. Buyer purchase and seller sales summaries expose counts and completed quote totals with an explicit note that settlement remains estimated.</w:t>
+      </w:r>
+    </w:p>
+    <w:p>
+      <w:pPr>
+        <w:pStyle w:val="H2"/>
+      </w:pPr>
+      <w:r>
+        <w:t>Feature switchboard and payment foundation</w:t>
+      </w:r>
+    </w:p>
+    <w:p>
+      <w:r>
+        <w:t>Added persistent versioned feature flags, default catalogue, dependency checks, risk tiers, mandatory reason and audit; Admin can change non-critical flags, critical flags require Super Admin/God Mode authority. Listing/order/offer/review/report/history routes and financial quote lines respect flags. Added payment and ledger persistence models plus an intentionally disabled provider adapter contract. No live payment, deduction, refund or payout is active.</w:t>
+      </w:r>
+    </w:p>
+    <w:p>
+      <w:pPr>
+        <w:pStyle w:val="H2"/>
+      </w:pPr>
+      <w:r>
+        <w:t>Central Registry</w:t>
+      </w:r>
+    </w:p>
+    <w:p>
+      <w:r>
+        <w:t>Added Registry field definitions and resources for marketplace feature flags, trust cases and restrictions; trust category and feature-state writes use Registry validation.</w:t>
+      </w:r>
+    </w:p>
+    <w:p>
+      <w:pPr>
+        <w:pStyle w:val="H2"/>
+      </w:pPr>
+      <w:r>
+        <w:t>Still open / safety boundary</w:t>
+      </w:r>
+    </w:p>
+    <w:p>
+      <w:r>
+        <w:t>Provider selection and signed webhook implementation, idempotent posting of balanced ledger entries, payment intent/capture, refunds/chargebacks, reconciliation, seller payout/settlement, jurisdiction-aware reviewed tax configuration, persistent media upload, deeper Registry validation for every trust field, public caution presentation policy, authenticated browser E2E and dedicated appeal/moderation screens beyond the Marketplace panels remain due. Do not collect money until payment/tax/legal/security/reconciliation gates pass.</w:t>
+      </w:r>
+    </w:p>
+    <w:p>
+      <w:pPr>
+        <w:pStyle w:val="Heading1"/>
+      </w:pPr>
+      <w:r>
+        <w:t>Marketplace final validation addendum — 2026-10-18 00:23:48 IST</w:t>
+      </w:r>
+    </w:p>
+    <w:p>
+      <w:r>
+        <w:t>Public feature-state API now drives UI visibility for listings, orders, reviews, reports and history. Public listings suppress sellers with active Marketplace-wide restrictions and expose only the moderated, unexpired caution rating/expiry without exposing evidence. Seller-side restriction checks also protect quote/order endpoints against stale direct requests. Admin cannot change tax settings; tax edits require Super Admin/God Mode and the UI preserves the configured review reference.</w:t>
+      </w:r>
+    </w:p>
+    <w:p>
+      <w:pPr>
+        <w:pStyle w:val="Heading1"/>
+      </w:pPr>
+      <w:r>
+        <w:t xml:space="preserve">Marketplace Wholesale Pricing and Signed Payment Sandbox (18 October 2026)</w:t>
+      </w:r>
+    </w:p>
+    <w:p>
+      <w:pPr>
+        <w:pStyle w:val="Normal"/>
+      </w:pPr>
+      <w:r>
+        <w:t xml:space="preserve">Marketplace listings support up to twelve Registry-validated quantity price tiers. Quote and order services choose the highest eligible tier for the requested quantity, preserve explicit buyer offers as separate negotiation values, and save the effective unit price in the immutable order pricing snapshot.</w:t>
+      </w:r>
+    </w:p>
+    <w:p>
+      <w:pPr>
+        <w:pStyle w:val="Heading2"/>
+      </w:pPr>
+      <w:r>
+        <w:t xml:space="preserve">Sandbox-only payment workflow</w:t>
+      </w:r>
+    </w:p>
+    <w:p>
+      <w:pPr>
+        <w:pStyle w:val="Normal"/>
+      </w:pPr>
+      <w:r>
+        <w:t xml:space="preserve">Sandbox payment simulation is a separate feature flag, disabled by default and gated by Super Admin/God Mode. Intent creation requires an accepted order owned by the buyer, an idempotency key, explicit sandbox runtime mode, and a sufficiently strong webhook secret. It never collects or transfers funds.</w:t>
+      </w:r>
+    </w:p>
+    <w:p>
+      <w:pPr>
+        <w:pStyle w:val="Normal"/>
+      </w:pPr>
+      <w:r>
+        <w:t xml:space="preserve">Webhook signatures are HMAC-SHA256 over exact raw request bytes and are compared in constant time. Provider event IDs are uniquely persisted with payload hashes; identical replays are idempotent and changed-payload re-use is rejected. Only CREATED -&gt; AUTHORIZED -&gt; CAPTURED or FAILED is allowed.</w:t>
+      </w:r>
+    </w:p>
+    <w:p>
+      <w:pPr>
+        <w:pStyle w:val="Normal"/>
+      </w:pPr>
+      <w:r>
+        <w:t xml:space="preserve">A simulated capture writes equal debit and credit entries to the append-only ledger with deterministic keys. This is accounting-path testing only. Live payment processing, refunds, payouts, tax remittance and settlement remain disabled pending provider, security, legal/accounting and reconciliation review.</w:t>
+      </w:r>
+    </w:p>
+    <w:p>
+      <w:pPr>
+        <w:pStyle w:val="Heading2"/>
+      </w:pPr>
+      <w:r>
+        <w:t xml:space="preserve">Next Marketplace release gates</w:t>
+      </w:r>
+    </w:p>
+    <w:p>
+      <w:pPr>
+        <w:pStyle w:val="Normal"/>
+      </w:pPr>
+      <w:r>
+        <w:t xml:space="preserve">Implement jurisdiction/product/category-aware reviewed tax profiles with effective dates; sandbox refund/chargeback reversals and reconciliation; authenticated browser E2E from listing through order, payment simulation, delivery, completion and review/dispute; formal caution/appeal UX; media retention/scanning; and the Admin/Super Admin/God Mode capability matrix. Never hardcode legal tax rates or reset production data.</w:t>
+      </w:r>
+    </w:p>
+    <w:p>
+      <w:pPr>
+        <w:pStyle w:val="Heading1"/>
+      </w:pPr>
+      <w:r>
+        <w:t xml:space="preserve">Sandbox Refund Requests and Balanced Ledger Reversals (18 October 2026)</w:t>
+      </w:r>
+    </w:p>
+    <w:p>
+      <w:pPr>
+        <w:pStyle w:val="Normal"/>
+      </w:pPr>
+      <w:r>
+        <w:t xml:space="preserve">Sandbox refunds are a separate feature flag, disabled by default and dependent on sandbox payment simulation. A request requires a captured sandbox payment, an accepted or completed buyer-owned order, an idempotency key, a positive amount, and a reason. Requested plus successful refunds reserve against the captured amount; requests exceeding the remaining amount are rejected.</w:t>
+      </w:r>
+    </w:p>
+    <w:p>
+      <w:pPr>
+        <w:pStyle w:val="Normal"/>
+      </w:pPr>
+      <w:r>
+        <w:t xml:space="preserve">Refund success/failure must arrive through an HMAC-SHA256 signature verified against the exact raw request bytes. Event identifiers and payload hashes are persisted to reject changed-payload replay. Only REQUESTED -&gt; SUCCEEDED or FAILED is allowed. A successful simulated refund appends equal debit/credit reversal entries with a refund-specific key and audit record. No money moves.</w:t>
+      </w:r>
+    </w:p>
+    <w:p>
+      <w:pPr>
+        <w:pStyle w:val="Normal"/>
+      </w:pPr>
+      <w:r>
+        <w:t xml:space="preserve">Live refunds, chargebacks, dispute deadlines/evidence, payout holds, settlement and reconciliation remain disabled until a provider adapter, signed event mapping, reconciliation controls and legal/accounting review are complete.</w:t>
+      </w:r>
+    </w:p>
+    <w:p>
+      <w:r>
+        <w:rPr>
+          <w:b/>
+          <w:sz w:val="28"/>
+        </w:rPr>
+        <w:t>Marketplace trust hardening - 18 Oct 2026</w:t>
+      </w:r>
+    </w:p>
+    <w:p>
+      <w:r>
+        <w:t>Permanent Marketplace-wide blacklist is available from an Admin or Super Admin trust-case decision by leaving duration blank. This is the only restriction scope that may be permanent.</w:t>
+      </w:r>
+    </w:p>
+    <w:p>
+      <w:r>
+        <w:t>Cautions and narrower restrictions require a 1-365 day expiry. The UI explains the no-expiry rule and labels the blacklist as permanent until manually revoked.</w:t>
+      </w:r>
+    </w:p>
+    <w:p>
+      <w:r>
+        <w:t>Active Marketplace-wide restrictions hide the seller</w:t>
+      </w:r>
+      <w:r>
+        <w:t xml:space="preserve">'s published listings from public discovery and block Marketplace actions. Revocation requires a reason and is audited; account and listing data are not hard-deleted.</w:t>
+      </w:r>
+    </w:p>
+    <w:p>
+      <w:r>
+        <w:t>Verification on 18 Oct 2026: full backend regression passed 65 suites and 623 tests; full browser suite passed 16 tests; dedicated Admin blacklist apply/revoke journey passed; backend and frontend production builds passed; database migration status was up to date.</w:t>
+      </w:r>
+    </w:p>
+    <w:p>
+      <w:r>
+        <w:rPr>
+          <w:b/>
+        </w:rPr>
+        <w:t xml:space="preserve">Marketplace parent workspace: Inventory and Finance submodules (18 Oct 2026)</w:t>
+      </w:r>
+    </w:p>
+    <w:p>
+      <w:r>
+        <w:t xml:space="preserve">Marketplace is the parent commercial workspace with Marketplace operations, Inventory and Finance tabs. Inventory and Finance are no longer independent farmer sidebar destinations. Legacy /app/inventory and /app/finance routes redirect into the corresponding Marketplace submodule.</w:t>
+      </w:r>
+    </w:p>
+    <w:p>
+      <w:r>
+        <w:t xml:space="preserve">The central Registry declares parentId=marketplace for Inventory and Finance, distinct from operational dependencies. A Registry invariant test protects this hierarchy.</w:t>
+      </w:r>
+    </w:p>
+    <w:p>
+      <w:r>
+        <w:t xml:space="preserve">Sellers can list an existing farm-owned inventory item. Server-side checks enforce ownership, active item state and available quantity. Completing a stock-linked order decrements the linked inventory item and Marketplace listing in the same transaction, records a STOCK_OUT ledger movement with the order reference and before/after quantities, writes an audit event and raises a low-stock notification when required.</w:t>
+      </w:r>
+    </w:p>
+    <w:p>
+      <w:r>
+        <w:t xml:space="preserve">The original farm-scoped authorization, stock history and soft-archive behavior remain in place. Finance remains a distinct farm income/expense ledger inside Marketplace; order quotes, buyer/seller history, settlement statements and reconciliation remain separate until verified payment and approved accounting mapping exist.</w:t>
+      </w:r>
+    </w:p>
+    <w:p>
+      <w:r>
+        <w:t xml:space="preserve">Verification: focused MarketplaceService suite passed 57 tests including linked stock decrement/ledger creation; central Registry suite passed 44 tests including parent integrity. Final frontend build and browser verification are tracked in the timestamped execution plan.</w:t>
+      </w:r>
+    </w:p>
+    <w:p>
+      <w:r>
+        <w:t xml:space="preserve">Release gates remain real provider-backed payment/refund/chargeback/payout integration, qualified tax/legal/accounting review, production media hardening and authenticated end-to-end testing. No sandbox flow is real money movement.</w:t>
+      </w:r>
+    </w:p>
+    <w:p>
+      <w:r>
+        <w:rPr>
+          <w:b/>
+        </w:rPr>
+        <w:t>Marketplace finance workspace consolidation - 18 Oct 2026</w:t>
+      </w:r>
+    </w:p>
+    <w:p>
+      <w:r>
+        <w:t xml:space="preserve">Buyer/seller order history, seller settlement statement, ledger reconciliation, payout-hold review/release, jurisdiction-aware tax profiles and Marketplace fee/tax policy controls now live in the Finance submodule alongside farm income/expense records.</w:t>
+      </w:r>
+    </w:p>
+    <w:p>
+      <w:r>
+        <w:t xml:space="preserve">Marketplace remains focused on listing discovery/creation, seller profiles, buyer/seller messaging, RFQs, orders and trust governance. Finance uses existing APIs and records; no duplicate ledger or transaction store was introduced.</w:t>
+      </w:r>
+    </w:p>
+    <w:p>
+      <w:r>
+        <w:t xml:space="preserve">Verification on 18 Oct 2026: backend production build passed; full backend regression passed 65 suites and 626 tests; frontend production build passed; full frontend Playwright suite passed 16 tests before the Finance-panel relocation, and both affected Marketplace browser journeys passed after relocation. The permanent blacklist and stock-linked listing browser coverage are included.</w:t>
+      </w:r>
+    </w:p>
+    <w:p>
+      <w:r>
+        <w:t xml:space="preserve">Production release gates remain real payment/refund/chargeback/payout provider integration, qualified tax/legal/accounting approval, production media/object-storage hardening and authenticated end-to-end verification with real roles. Live money movement remains disabled.</w:t>
+      </w:r>
+    </w:p>
+    <w:p>
+      <w:pPr>
+        <w:pStyle w:val="Heading2"/>
+      </w:pPr>
+      <w:r>
+        <w:t>Order dispute workflow (implemented local workflow)</w:t>
+      </w:r>
+    </w:p>
+    <w:p>
+      <w:r>
+        <w:t>Buyers and sellers can open an explicit DISPUTE against an order after the seller has acted on it. A dispute must reference the order; the server verifies the reporter is a participant and derives the counterparty from the order rather than trusting client-supplied identity.</w:t>
+      </w:r>
+    </w:p>
+    <w:p>
+      <w:r>
+        <w:t>Disputes use the existing persistent, audited Marketplace trust-case queue, keep evidence links private to authorized reviewers, and support review, resolution or dismissal, and the existing caution/restriction governance where warranted.</w:t>
+      </w:r>
+    </w:p>
+    <w:p>
+      <w:r>
+        <w:t>Admin or Super Admin can separately record payout holds only when a captured payment record exists. Holds and reconciliation remain statement/governance records, not actual fund movement.</w:t>
+      </w:r>
+    </w:p>
+    <w:p>
+      <w:r>
+        <w:t>The UI states that an internal dispute is not a payment-provider chargeback and does not move funds. Provider-backed chargebacks, evidence deadlines, external arbitration, real settlement/payout, and compliance review remain production gates.</w:t>
       </w:r>
     </w:p>
     <w:sectPr>
@@ -12643,6 +13336,247 @@
       <w:cols w:space="708"/>
       <w:docGrid w:linePitch="360"/>
     </w:sectPr>
+    <w:p>
+      <w:pPr>
+        <w:pStyle w:val="Heading1"/>
+      </w:pPr>
+      <w:r>
+        <w:t xml:space="preserve">2026-10-16 — Multilingual AI Intake and Module Closure Gate</w:t>
+      </w:r>
+    </w:p>
+    <w:p>
+      <w:r>
+        <w:t xml:space="preserve">Canonical detail: docs/AI-INTAKE-MULTILINGUAL-CONTRACT.md. AI Intake preserves the original transcript/language and reviewed English meaning separately, enforces explicit non-English confirmation on the server, and stores provenance in the existing FarmRecord JSON. No database schema migration or reset was required.</w:t>
+      </w:r>
+    </w:p>
+    <w:p>
+      <w:r>
+        <w:t xml:space="preserve">Verification: frontend TypeScript/Vite production build PASS; focused Intake, Livestock and Marketplace backend suites PASS (3 suites / 32 tests); API health HTTP 200; git diff --check PASS.</w:t>
+      </w:r>
+    </w:p>
+    <w:p>
+      <w:r>
+        <w:t xml:space="preserve">Limitations and closure gates: browser speech recognition is not translation. A replaceable approved translation provider, confidence/deviation stop-and-clarify behavior, and authenticated browser/database acceptance remain open. Livestock and Marketplace must remain PARTIAL until their full authorization, lifecycle/history, frontend and seller/buyer acceptance gates pass. AI remains advisory and may not write directly to the database; no cloud fallback.</w:t>
+      </w:r>
+    </w:p>
+    <w:p>
+      <w:pPr>
+        <w:pStyle w:val="Heading1"/>
+      </w:pPr>
+      <w:r>
+        <w:t xml:space="preserve">2026-10-16 — Livestock and Marketplace usability follow-through</w:t>
+      </w:r>
+    </w:p>
+    <w:p>
+      <w:r>
+        <w:t xml:space="preserve">Livestock now exposes edit, ownership-history and archived restore flows. Marketplace listing creation selects available owned crops, livestock and non-archived farm assets rather than requiring an internal resource ID. Backend build and frontend production build passed; Intake, Livestock and Marketplace focused regression passed 33/33 tests; API health and frontend both returned HTTP 200; git diff --check passed.</w:t>
+      </w:r>
+    </w:p>
+    <w:p>
+      <w:r>
+        <w:t xml:space="preserve">Completion boundary: authenticated browser acceptance remains open. Marketplace buyer inquiry/transaction workflows are not implemented by this increment. Keep both module completion statuses PARTIAL until their full lifecycle, authorization, history/audit and browser acceptance gates pass. Automatic multilingual translation and confidence/deviation clarification remain open as specified in the AI Intake contract.</w:t>
+      </w:r>
+    </w:p>
+    <w:p>
+      <w:pPr>
+        <w:pStyle w:val="Heading2"/>
+      </w:pPr>
+      <w:r>
+        <w:t>Marketplace wholesale minimum order quantity — 18 Oct 2026</w:t>
+      </w:r>
+    </w:p>
+    <w:p>
+      <w:r>
+        <w:t>Marketplace listing requirements include an optional minimum order quantity expressed in the listing unit. The field is nullable for existing listings; when set, backend quote and order creation reject smaller quantities even if the frontend is bypassed. Registry field marketplaceListingMinimumOrderQuantity is the canonical validation source. Listing UI discloses the minimum before a buyer places an order. Inventory stock limits and atomic decrement at completion remain separate controls. The additive migration is 20261018113000_marketplace_minimum_order_quantity. Follow-on requirements: wholesale price tiers, negotiated counter-offers, persistent media, fulfillment tracking, reviewed jurisdiction/category tax profiles, sandbox payment integration, refunds and settlement reconciliation.</w:t>
+      </w:r>
+    </w:p>
+    <w:p>
+      <w:pPr>
+        <w:pStyle w:val="Heading2"/>
+      </w:pPr>
+      <w:r>
+        <w:t>Marketplace iterative counter-offers — 18 Oct 2026</w:t>
+      </w:r>
+    </w:p>
+    <w:p>
+      <w:r>
+        <w:t>A buyer may counter a seller-revised price when an order is awaiting buyer price confirmation. The authenticated buyer counter-offer returns the order to PENDING, refreshes the provisional fee/tax quote and pricing snapshot, records an audit event and notifies the seller. The offers feature flag is checked server-side. Repeat negotiation until acceptance/confirmation or cancellation; no payment is collected. Next Marketplace gaps include persistent media, fulfillment tracking, wholesale price tiers, jurisdiction-aware tax profiles, payment sandbox and refund/settlement controls.</w:t>
+      </w:r>
+    </w:p>
+    <w:p>
+      <w:pPr>
+        <w:pStyle w:val="Heading2"/>
+      </w:pPr>
+      <w:r>
+        <w:t>Marketplace delivery tracking and buyer receipt — 18 Oct 2026</w:t>
+      </w:r>
+    </w:p>
+    <w:p>
+      <w:r>
+        <w:t>Accepted orders can record seller-managed delivery status, carrier, tracking number, HTTPS tracking URL, estimated delivery date and dispatch timestamp. Seller updates are order-owner restricted, Registry-validated, transition-checked, audited and notify the buyer. Buyers can confirm receipt after dispatch/in-transit. Tracked orders cannot be marked complete by the seller until the buyer confirms receipt. The feature is controlled by marketplace.delivery and depends on marketplace.orders. This does not imply a live carrier integration, shipping-rate engine, return authorization or refund service.</w:t>
+      </w:r>
+    </w:p>
+    <w:p>
+      <w:pPr>
+        <w:pStyle w:val="Heading2"/>
+      </w:pPr>
+      <w:r>
+        <w:t>Marketplace persistent photo/video uploads — 18 Oct 2026</w:t>
+      </w:r>
+    </w:p>
+    <w:p>
+      <w:r>
+        <w:t>Authenticated sellers can upload JPEG/PNG/WebP/AVIF images up to 15 MiB and MP4/WebM video up to 100 MiB. Randomized temporary filenames stay outside the public directory; content signatures are checked before files move to UUID-based final keys. Uploads require listing-create authorization, respect Marketplace restrictions and the marketplace.media_uploads feature flag, and are audited. The default local storage directory is backend/uploads/marketplace, configurable through KK_MARKETPLACE_MEDIA_DIR; user-uploaded files are Git-ignored. This local adapter is not yet malware-scanned, object-storage-backed or retention/orphan-cleanup complete; those remain production hardening requirements.</w:t>
+      </w:r>
+    </w:p>
+    <w:p>
+      <w:pPr>
+        <w:pStyle w:val="Heading2"/>
+      </w:pPr>
+      <w:r>
+        <w:t>Marketplace quantity-based wholesale prices — 18 Oct 2026</w:t>
+      </w:r>
+    </w:p>
+    <w:p>
+      <w:r>
+        <w:t>Listings support up to 12 quantity-based wholesale price tiers, entered as minimum quantity/unit price pairs. Central Registry definitions validate thresholds and unit prices; the service enforces unique increasing thresholds. Quotes and orders select the highest eligible tier for the requested quantity. Buyer offers remain distinct from the applicable listed/tier unit price snapshot. The marketplace.wholesale_pricing feature flag governs server behavior and UI visibility. Existing listings remain compatible through the nullable JSON field added by migration 20261018120500_marketplace_wholesale_price_tiers.</w:t>
+      </w:r>
+    </w:p>
+    <w:p>
+      <w:pPr>
+        <w:pStyle w:val="Heading2"/>
+      </w:pPr>
+      <w:r>
+        <w:t>Marketplace sandbox payment simulation — 18 Oct 2026</w:t>
+      </w:r>
+    </w:p>
+    <w:p>
+      <w:r>
+        <w:t>A buyer-owned accepted order can create an idempotent sandbox payment intent with an immutable quote snapshot. The route requires marketplace.payment_sandbox (critical risk, OFF by default), KK_MARKETPLACE_PAYMENT_MODE=sandbox and a webhook secret of at least 32 characters. Signed webhooks use raw bytes, HMAC-SHA256, timing-safe signature comparison, replay/payload-hash checks, amount/currency matching and a payment state machine. Simulated CAPTURED writes equal debit/credit entries to the append-only ledger and is audited. This is a test simulation only: no funds move. Live provider capture, refunds, chargebacks, payouts, reconciliation and tax remittance remain disabled pending separate security/provider/accounting review.</w:t>
+      </w:r>
+    </w:p>
+    <w:p>
+      <w:pPr>
+        <w:pStyle w:val="Heading1"/>
+      </w:pPr>
+      <w:r>
+        <w:t>Marketplace settlement and reconciliation controls</w:t>
+      </w:r>
+    </w:p>
+    <w:p>
+      <w:r>
+        <w:t xml:space="preserve">Seller-scoped statements report per-order gross, commission, estimated seller net, sandbox capture/refund values, active payout-hold records and explicit NOT_PAID_OUT status. Sandbox events must never imply real funds were received or paid out.</w:t>
+      </w:r>
+    </w:p>
+    <w:p>
+      <w:r>
+        <w:t xml:space="preserve">Super Admin/God Mode can create and release payout-hold governance records for orders with captured-payment records. Each hold requires a reason, bounded optional expiry and audit history. The hold record does not hold or release funds and does not authorize a payout.</w:t>
+      </w:r>
+    </w:p>
+    <w:p>
+      <w:r>
+        <w:t xml:space="preserve">Super Admin/God Mode can run persistent ledger reconciliation reports covering debit/credit totals by currency, invalid ledger amounts/directions, captured payments missing ledger pairs, successful refunds missing reversal pairs and exception counts. Runs are audited and never move money.</w:t>
+      </w:r>
+    </w:p>
+    <w:p>
+      <w:r>
+        <w:t xml:space="preserve">Jurisdiction-aware tax profiles remain drafts until approved by Super Admin/God Mode with a qualified tax/legal review reference. Matching requires seller jurisdiction, buyer jurisdiction, category and effective date. Historical order quote snapshots remain unchanged.</w:t>
+      </w:r>
+    </w:p>
+    <w:p>
+      <w:r>
+        <w:t xml:space="preserve">Real payment capture/refund, tax remittance and payouts remain disabled until provider integration, signed and idempotent webhooks, chargeback/dispute handling, reconciliation and qualified legal/accounting review pass authenticated end-to-end tests.</w:t>
+      </w:r>
+    </w:p>
+    <w:p>
+      <w:pPr>
+        <w:pStyle w:val="Heading1"/>
+      </w:pPr>
+      <w:r>
+        <w:t>Marketplace seller profiles, saved listings, messaging and bulk RFQs</w:t>
+      </w:r>
+    </w:p>
+    <w:p>
+      <w:r>
+        <w:t xml:space="preserve">Seller profiles support display name, bio, coarse region and contact preference. Public phone is redacted unless the seller explicitly enables public display; soft-deleted users are not exposed.</w:t>
+      </w:r>
+    </w:p>
+    <w:p>
+      <w:r>
+        <w:t xml:space="preserve">Favorites are private per user and are removed by status transition, not hard deletion. Buyer/seller messages are tied to listings or orders, participant-scoped, length-bounded and audited. Order messages can only be sent to the other transaction participant; seller listing replies require an existing buyer inquiry.</w:t>
+      </w:r>
+    </w:p>
+    <w:p>
+      <w:r>
+        <w:t xml:space="preserve">Bulk RFQs support category, quantity/unit, target price, delivery region, needed-by date, seller quotations, validity, buyer accept/reject and cancellation. Accepting a quote records a negotiation award only; it does not create an order or move money.</w:t>
+      </w:r>
+    </w:p>
+    <w:p>
+      <w:r>
+        <w:t xml:space="preserve">Registry resource/capability definitions and field definitions cover seller profiles, favorites, messages, RFQs and RFQ responses. Feature switches control each workflow while preserving audit and historical records.</w:t>
+      </w:r>
+    </w:p>
+    <w:p>
+      <w:r>
+        <w:t xml:space="preserve">Release gate: apply additive migration 20261018140000_marketplace_profiles_favorites_messages_rfqs, pass full backend regression and authenticated E2E privacy/role/feature-toggle checks. Real payment capture, refund, tax remittance and payout remain disabled pending provider and qualified compliance review.</w:t>
+      </w:r>
+    </w:p>
+    <w:p>
+      <w:pPr>
+        <w:pStyle w:val="Heading1"/>
+      </w:pPr>
+      <w:r>
+        <w:t>Final Marketplace verification and acceptance</w:t>
+      </w:r>
+    </w:p>
+    <w:p>
+      <w:r>
+        <w:t xml:space="preserve">Marketplace backend regression completed with 65 suites and 620 passing tests. Backend and frontend production builds are verified separately; the Marketplace Playwright journey validates the buyer/seller workspace, private messaging, saved listings, bulk RFQ submission and the statement-only settlement disclosure.</w:t>
+      </w:r>
+    </w:p>
+    <w:p>
+      <w:r>
+        <w:t xml:space="preserve">The Playwright journey identified and fixed native number-input step validation that prevented round decimal quantities from submitting. RFQ and minimum-order quantity fields now permit decimal quantities.</w:t>
+      </w:r>
+    </w:p>
+    <w:p>
+      <w:r>
+        <w:t xml:space="preserve">The reviewed-tax, payout-hold/reconciliation and seller-profile/favorites/messages/RFQ migrations have been applied additively. A pre-existing database migration record, 20261004160000_god_mode_authority_tier, is absent from the local migration directory; preserve that history and do not reset the database or volumes.</w:t>
+      </w:r>
+    </w:p>
+    <w:p>
+      <w:r>
+        <w:t xml:space="preserve">Real payment capture, real refunds, tax remittance and payouts remain disabled. Seller statements and payout holds are governance/estimate records only until payment provider integration, signed idempotent webhooks, chargeback handling and qualified legal/accounting review are complete.</w:t>
+      </w:r>
+    </w:p>
+    <w:p>
+      <w:pPr>
+        <w:pStyle w:val="Heading1"/>
+      </w:pPr>
+      <w:r>
+        <w:t>Marketplace final implementation verification</w:t>
+      </w:r>
+    </w:p>
+    <w:p>
+      <w:r>
+        <w:t xml:space="preserve">Backend production build passed and the full backend regression passed 65 suites / 621 tests. Frontend TypeScript and Vite production build passed. The Marketplace Playwright journey passed, covering seller profile/privacy, saved listings, private messages, bulk RFQ creation and settlement transparency.</w:t>
+      </w:r>
+    </w:p>
+    <w:p>
+      <w:r>
+        <w:t xml:space="preserve">The tax-profile, payout-hold/reconciliation and seller-profile/favorites/messages/RFQ additive migrations were applied. The backend and frontend user-level services were restarted and are active. API health, Marketplace categories, public feature flags, commerce policy and UI smoke checks all returned HTTP 200; protected endpoints return HTTP 401 when called without authentication.</w:t>
+      </w:r>
+    </w:p>
+    <w:p>
+      <w:r>
+        <w:t xml:space="preserve">The RFQ workflow supports quote validity and rejects expired quotations at decision time. Decimal quantity inputs support fractional supply quantities. Registry resources and fields govern the new seller-profile, favorite, message and RFQ resources.</w:t>
+      </w:r>
+    </w:p>
+    <w:p>
+      <w:r>
+        <w:t xml:space="preserve">Real payment collection, real refunds/chargebacks, tax remittance and seller payouts remain disabled. Provider integration, signed idempotent webhooks, object-storage hardening and qualified legal/accounting review are release gates. Preserve the existing migration-history discrepancy and never reset database volumes.</w:t>
+      </w:r>
+    </w:p>
   </w:body>
 </w:document>
 </file>

</xml_diff>

<commit_message>
Add Registry-backed Reports and Analytics module
</commit_message>
<xml_diff>
--- a/Absolutely KK PMD.docx
+++ b/Absolutely KK PMD.docx
@@ -13328,6 +13328,39 @@
     <w:p>
       <w:r>
         <w:t>The UI states that an internal dispute is not a payment-provider chargeback and does not move funds. Provider-backed chargebacks, evidence deadlines, external arbitration, real settlement/payout, and compliance review remain production gates.</w:t>
+      </w:r>
+    </w:p>
+    <w:p>
+      <w:pPr>
+        <w:pStyle w:val="Heading2"/>
+      </w:pPr>
+      <w:r>
+        <w:t>Reports &amp; Analytics module (implemented backend workflow)</w:t>
+      </w:r>
+    </w:p>
+    <w:p>
+      <w:r>
+        <w:t>The Reports screen reads a single authenticated backend overview endpoint composed from existing authorized farm, crop, livestock, inventory, finance and current-user Marketplace services. Reporting is read-only and does not mutate domain records.</w:t>
+      </w:r>
+    </w:p>
+    <w:p>
+      <w:r>
+        <w:t>Farm filtering is verified against the authenticated user’s accessible farms. Registry-backed farm/date filters require real calendar dates and reject reversed ranges. If farm access cannot be verified for a requested filter, the report fails closed.</w:t>
+      </w:r>
+    </w:p>
+    <w:p>
+      <w:r>
+        <w:t>The response contains an as-of timestamp, per-farm counts, inventory reorder alerts, filtered financial detail and currency-separated income/expense/net totals. Currency values are never mixed and no foreign-exchange rate is invented.</w:t>
+      </w:r>
+    </w:p>
+    <w:p>
+      <w:r>
+        <w:t>Optional source failures are returned as warnings while other authorized sections remain available. Marketplace counts are limited to the current seller and are not attributed to a farm without an explicit relationship. CSV export carries the summaries, financial detail, filters and scope notes.</w:t>
+      </w:r>
+    </w:p>
+    <w:p>
+      <w:r>
+        <w:t>Reports are operational summaries, not bank balances, audited financial statements, tax advice or statutory filings.</w:t>
       </w:r>
     </w:p>
     <w:sectPr>

</xml_diff>

<commit_message>
Complete governed Notifications and Alerts module
</commit_message>
<xml_diff>
--- a/Absolutely KK PMD.docx
+++ b/Absolutely KK PMD.docx
@@ -13361,6 +13361,39 @@
     <w:p>
       <w:r>
         <w:t>Reports are operational summaries, not bank balances, audited financial statements, tax advice or statutory filings.</w:t>
+      </w:r>
+    </w:p>
+    <w:p>
+      <w:pPr>
+        <w:pStyle w:val="Heading2"/>
+      </w:pPr>
+      <w:r>
+        <w:t>Notifications &amp; Alerts module (in-app event governance)</w:t>
+      </w:r>
+    </w:p>
+    <w:p>
+      <w:r>
+        <w:t>Notifications are authenticated, user-scoped persisted in-app events with bounded listing, type/severity/unread filters, unread count, mark-one-read and mark-all-read. Every query/update is scoped by the current user.</w:t>
+      </w:r>
+    </w:p>
+    <w:p>
+      <w:r>
+        <w:t>Events carry INFO, SUCCESS, WARNING or CRITICAL severity, source module, stable deduplication key and expiry. Default retention is 180 days; expired notifications are hidden and retained rather than hard-deleted.</w:t>
+      </w:r>
+    </w:p>
+    <w:p>
+      <w:r>
+        <w:t>A shared transaction-safe writer is used by Inventory low-stock, Marketplace order/delivery/counter-offer and Livestock follow-up events. A compound per-user dedupe key and createMany(skipDuplicates) avoid duplicate rows without aborting the business transaction.</w:t>
+      </w:r>
+    </w:p>
+    <w:p>
+      <w:r>
+        <w:t>Registry definitions govern notification fields and query filters. List limits are bounded to 100. Hrefs are restricted to internal /app/ routes; external links are suppressed. The UI provides severity/type/unread filters and immediate local read-state updates.</w:t>
+      </w:r>
+    </w:p>
+    <w:p>
+      <w:r>
+        <w:t>External SMS/email/push delivery remains a separate plug-in integration. The in-app notification workflow does not physically delete notification history.</w:t>
       </w:r>
     </w:p>
     <w:sectPr>

</xml_diff>

<commit_message>
Enforce explicit user restore lifecycle
</commit_message>
<xml_diff>
--- a/Absolutely KK PMD.docx
+++ b/Absolutely KK PMD.docx
@@ -13394,6 +13394,62 @@
     <w:p>
       <w:r>
         <w:t>External SMS/email/push delivery remains a separate plug-in integration. The in-app notification workflow does not physically delete notification history.</w:t>
+      </w:r>
+    </w:p>
+    <w:p>
+      <w:pPr>
+        <w:pStyle w:val="Heading1"/>
+      </w:pPr>
+      <w:r>
+        <w:t xml:space="preserve">User Lifecycle Restore Governance — October 2026</w:t>
+      </w:r>
+    </w:p>
+    <w:p>
+      <w:pPr>
+        <w:pStyle w:val="ListParagraph"/>
+      </w:pPr>
+      <w:r>
+        <w:t xml:space="preserve">PENDING_DELETE is a reversible, auditable lifecycle state, not hard deletion.</w:t>
+      </w:r>
+    </w:p>
+    <w:p>
+      <w:pPr>
+        <w:pStyle w:val="ListParagraph"/>
+      </w:pPr>
+      <w:r>
+        <w:t xml:space="preserve">Normal user updates must not transition a PENDING_DELETE account to ACTIVE or DELETED. Reactivation must use POST /users/:id/restore.</w:t>
+      </w:r>
+    </w:p>
+    <w:p>
+      <w:pPr>
+        <w:pStyle w:val="ListParagraph"/>
+      </w:pPr>
+      <w:r>
+        <w:t xml:space="preserve">The restore transaction re-checks PENDING_DELETE, restores ACTIVE, clears deletion-request flags, and writes user history and an AuditEvent with actor attribution.</w:t>
+      </w:r>
+    </w:p>
+    <w:p>
+      <w:pPr>
+        <w:pStyle w:val="ListParagraph"/>
+      </w:pPr>
+      <w:r>
+        <w:t xml:space="preserve">The admin Users workspace exposes Restore only for PENDING_DELETE rows and restricts status editing while deletion is pending.</w:t>
+      </w:r>
+    </w:p>
+    <w:p>
+      <w:pPr>
+        <w:pStyle w:val="ListParagraph"/>
+      </w:pPr>
+      <w:r>
+        <w:t xml:space="preserve">Acceptance evidence: focused service tests reject direct reactivation and stale restore attempts; the Playwright lifecycle journey covers creation, explicit restore, and activity/relationship empty states.</w:t>
+      </w:r>
+    </w:p>
+    <w:p>
+      <w:pPr>
+        <w:pStyle w:val="ListParagraph"/>
+      </w:pPr>
+      <w:r>
+        <w:t xml:space="preserve">The Users module remains PARTIAL overall until full regression, production builds, runtime checks, and CBA promotion pass.</w:t>
       </w:r>
     </w:p>
     <w:sectPr>

</xml_diff>

<commit_message>
Expose permission registry reconciliation in admin UI
</commit_message>
<xml_diff>
--- a/Absolutely KK PMD.docx
+++ b/Absolutely KK PMD.docx
@@ -13450,6 +13450,46 @@
       </w:pPr>
       <w:r>
         <w:t xml:space="preserve">The Users module remains PARTIAL overall until full regression, production builds, runtime checks, and CBA promotion pass.</w:t>
+      </w:r>
+    </w:p>
+    <w:p>
+      <w:pPr>
+        <w:pStyle w:val="Heading1"/>
+      </w:pPr>
+      <w:r>
+        <w:t xml:space="preserve">Authorization Registry Reconciliation — October 2026</w:t>
+      </w:r>
+    </w:p>
+    <w:p>
+      <w:pPr>
+        <w:pStyle w:val="ListParagraph"/>
+      </w:pPr>
+      <w:r>
+        <w:t xml:space="preserve">The Permissions page must expose the canonical Registry reconciliation summary: declared capabilities, persisted resource permissions, covered declarations, missing declarations and stale persisted permissions.</w:t>
+      </w:r>
+    </w:p>
+    <w:p>
+      <w:pPr>
+        <w:pStyle w:val="ListParagraph"/>
+      </w:pPr>
+      <w:r>
+        <w:t xml:space="preserve">The page must list missing and stale entries for diagnosis while remaining read-only. The Registry is authoritative and backend Authorization remains the sole decision engine.</w:t>
+      </w:r>
+    </w:p>
+    <w:p>
+      <w:pPr>
+        <w:pStyle w:val="ListParagraph"/>
+      </w:pPr>
+      <w:r>
+        <w:t xml:space="preserve">Permission-matrix loading and reconciliation loading/errors must be independent so reconciliation failure does not hide the persisted permission matrix.</w:t>
+      </w:r>
+    </w:p>
+    <w:p>
+      <w:pPr>
+        <w:pStyle w:val="ListParagraph"/>
+      </w:pPr>
+      <w:r>
+        <w:t xml:space="preserve">Acceptance evidence: backend reconciliation unit tests, frontend production build and the Super Admin Playwright reconciliation journey. Full regression and CBA promotion are required before the gate is closed.</w:t>
       </w:r>
     </w:p>
     <w:sectPr>

</xml_diff>

<commit_message>
Close farm archive and restore lifecycle invariants
</commit_message>
<xml_diff>
--- a/Absolutely KK PMD.docx
+++ b/Absolutely KK PMD.docx
@@ -13490,6 +13490,54 @@
       </w:pPr>
       <w:r>
         <w:t xml:space="preserve">Acceptance evidence: backend reconciliation unit tests, frontend production build and the Super Admin Playwright reconciliation journey. Full regression and CBA promotion are required before the gate is closed.</w:t>
+      </w:r>
+    </w:p>
+    <w:p>
+      <w:pPr>
+        <w:pStyle w:val="Heading2"/>
+      </w:pPr>
+      <w:r>
+        <w:t xml:space="preserve">Farm lifecycle archive and restore safeguards — 18 Oct 2026</w:t>
+      </w:r>
+    </w:p>
+    <w:p>
+      <w:pPr>
+        <w:pStyle w:val="ListParagraph"/>
+      </w:pPr>
+      <w:r>
+        <w:t xml:space="preserve">• Archived farms cannot be edited or receive new FarmRecords through direct API or Intake composite transactions.</w:t>
+      </w:r>
+    </w:p>
+    <w:p>
+      <w:pPr>
+        <w:pStyle w:val="ListParagraph"/>
+      </w:pPr>
+      <w:r>
+        <w:t xml:space="preserve">• Restore is an atomic archived-to-active transition. Only a row still marked archived can be claimed; stale or concurrent restore attempts create no duplicate active OWNER relationship or RESTORE audit event.</w:t>
+      </w:r>
+    </w:p>
+    <w:p>
+      <w:pPr>
+        <w:pStyle w:val="ListParagraph"/>
+      </w:pPr>
+      <w:r>
+        <w:t xml:space="preserve">• Switching between active and archived farms immediately reloads the list rather than waiting for periodic refresh.</w:t>
+      </w:r>
+    </w:p>
+    <w:p>
+      <w:pPr>
+        <w:pStyle w:val="ListParagraph"/>
+      </w:pPr>
+      <w:r>
+        <w:t xml:space="preserve">• Acceptance evidence: FarmsService 45/45; full backend regression 66 suites / 644 tests; backend and frontend production builds pass; authenticated archive/restore browser journey passes 1/1; full frontend Playwright suite passes 19/19.</w:t>
+      </w:r>
+    </w:p>
+    <w:p>
+      <w:pPr>
+        <w:pStyle w:val="ListParagraph"/>
+      </w:pPr>
+      <w:r>
+        <w:t xml:space="preserve">• These safeguards use existing Registry validation, AuthorizationService decisions, temporal ownership relationships and audit history. No schema migration, hard deletion or database reset was required.</w:t>
       </w:r>
     </w:p>
     <w:sectPr>

</xml_diff>

<commit_message>
Close archived-parent farm asset lifecycle invariants
</commit_message>
<xml_diff>
--- a/Absolutely KK PMD.docx
+++ b/Absolutely KK PMD.docx
@@ -13785,6 +13785,24 @@
     <w:p>
       <w:r>
         <w:t xml:space="preserve">Real payment collection, real refunds/chargebacks, tax remittance and seller payouts remain disabled. Provider integration, signed idempotent webhooks, object-storage hardening and qualified legal/accounting review are release gates. Preserve the existing migration-history discrepancy and never reset database volumes.</w:t>
+      </w:r>
+    </w:p>
+    <w:p>
+      <w:pPr>
+        <w:pStyle w:val="Heading1"/>
+      </w:pPr>
+      <w:r>
+        <w:t>Farm Assets: Archived Parent and Temporal Integrity</w:t>
+      </w:r>
+    </w:p>
+    <w:p>
+      <w:r>
+        <w:t>Farm Assets are governed child resources. Create, update, removal, custody changes, lease start/end, ownership transfer, split, and merge must reject an archived parent farm. Composite write workflows must re-check Farm.deletedAt IS NULL inside the same database transaction as the mutation so an archive racing with the operation causes all changes to roll back.</w:t>
+      </w:r>
+    </w:p>
+    <w:p>
+      <w:r>
+        <w:t>Asset relationship, movement, lineage, evidence, and audit records are atomic and must not be deleted when a farm is archived. Historical reads remain subject to normal authorization. Split and merge preserve positive quantities, common units, consistent ownership, temporal ordering, compare-and-swap quantity updates, and atomic movement/lineage/audit creation. All new asset mutation workflows must use the shared assertFarmActive guard.</w:t>
       </w:r>
     </w:p>
   </w:body>

</xml_diff>

<commit_message>
Close direct FarmRecord archive race
</commit_message>
<xml_diff>
--- a/Absolutely KK PMD.docx
+++ b/Absolutely KK PMD.docx
@@ -13803,6 +13803,19 @@
     <w:p>
       <w:r>
         <w:t>Asset relationship, movement, lineage, evidence, and audit records are atomic and must not be deleted when a farm is archived. Historical reads remain subject to normal authorization. Split and merge preserve positive quantities, common units, consistent ownership, temporal ordering, compare-and-swap quantity updates, and atomic movement/lineage/audit creation. All new asset mutation workflows must use the shared assertFarmActive guard.</w:t>
+      </w:r>
+    </w:p>
+    <w:p>
+      <w:pPr>
+        <w:pStyle w:val="Heading1"/>
+      </w:pPr>
+      <w:r>
+        <w:t>Farm Records: Direct and Composite Active-Parent Guard</w:t>
+      </w:r>
+    </w:p>
+    <w:p>
+      <w:r>
+        <w:t>Direct FarmRecord creation and composite Intake persistence must both re-check that the parent farm is active inside the database transaction. The direct API performs minimal farm context and authorization checks first, validates through the central Registry, then uses the shared active-farm guard before inserting the record and actor-attributed audit entry. If the farm is archived before the transaction write, no record or audit side effect is created. Archiving a farm does not delete historical records; normal authorization still governs historical reads.</w:t>
       </w:r>
     </w:p>
   </w:body>

</xml_diff>

<commit_message>
Close crop archive races across create update restore
</commit_message>
<xml_diff>
--- a/Absolutely KK PMD.docx
+++ b/Absolutely KK PMD.docx
@@ -13816,6 +13816,19 @@
     <w:p>
       <w:r>
         <w:t>Direct FarmRecord creation and composite Intake persistence must both re-check that the parent farm is active inside the database transaction. The direct API performs minimal farm context and authorization checks first, validates through the central Registry, then uses the shared active-farm guard before inserting the record and actor-attributed audit entry. If the farm is archived before the transaction write, no record or audit side effect is created. Archiving a farm does not delete historical records; normal authorization still governs historical reads.</w:t>
+      </w:r>
+    </w:p>
+    <w:p>
+      <w:pPr>
+        <w:pStyle w:val="Heading1"/>
+      </w:pPr>
+      <w:r>
+        <w:t>Crop: Active Parent and Lifecycle Integrity</w:t>
+      </w:r>
+    </w:p>
+    <w:p>
+      <w:r>
+        <w:t>All crop creation routes, including direct create and both Intake paths, must use the canonical CropsService boundary and re-check Farm.deletedAt IS NULL inside the transaction that writes the crop, temporal owner relationship and audit record. Crop updates re-check the active parent inside the update transaction; crop restore is prohibited under an archived parent farm and rechecks parent state inside the restore transaction. Parent archive must not erase historical crop, relationship or audit records. Registry normalization and same-day duplicate protection remain centralized in CropsService. No schema migration is required for these service-level invariants.</w:t>
       </w:r>
     </w:p>
   </w:body>

</xml_diff>

<commit_message>
feat(marketplace): add sandbox chargeback evidence lifecycle
</commit_message>
<xml_diff>
--- a/Absolutely KK PMD.docx
+++ b/Absolutely KK PMD.docx
@@ -13829,6 +13829,62 @@
     <w:p>
       <w:r>
         <w:t>All crop creation routes, including direct create and both Intake paths, must use the canonical CropsService boundary and re-check Farm.deletedAt IS NULL inside the transaction that writes the crop, temporal owner relationship and audit record. Crop updates re-check the active parent inside the update transaction; crop restore is prohibited under an archived parent farm and rechecks parent state inside the restore transaction. Parent archive must not erase historical crop, relationship or audit records. Registry normalization and same-day duplicate protection remain centralized in CropsService. No schema migration is required for these service-level invariants.</w:t>
+      </w:r>
+    </w:p>
+    <w:p>
+      <w:pPr>
+        <w:pStyle w:val="Heading1"/>
+      </w:pPr>
+      <w:r>
+        <w:t xml:space="preserve">Marketplace Chargeback Workflow</w:t>
+      </w:r>
+    </w:p>
+    <w:p>
+      <w:pPr>
+        <w:pStyle w:val="Normal"/>
+      </w:pPr>
+      <w:r>
+        <w:t xml:space="preserve">Sandbox-only workflow; it does not contact a payment processor or move money.</w:t>
+      </w:r>
+    </w:p>
+    <w:p>
+      <w:pPr>
+        <w:pStyle w:val="Normal"/>
+      </w:pPr>
+      <w:r>
+        <w:t xml:space="preserve">Buyer opens a chargeback simulation against their own accepted or completed order with a captured sandbox payment. The request records an idempotency key, immutable amount and currency, reason, optional HTTPS evidence links, and a seven-day evidence deadline.</w:t>
+      </w:r>
+    </w:p>
+    <w:p>
+      <w:pPr>
+        <w:pStyle w:val="Normal"/>
+      </w:pPr>
+      <w:r>
+        <w:t xml:space="preserve">The system reserves the amount together with requested/successful refunds and other open/lost chargebacks, preventing duplicate claims against captured funds. Opening a chargeback creates an audited, record-only payout hold for the seller.</w:t>
+      </w:r>
+    </w:p>
+    <w:p>
+      <w:pPr>
+        <w:pStyle w:val="Normal"/>
+      </w:pPr>
+      <w:r>
+        <w:t xml:space="preserve">The seller on the order can submit up to ten HTTPS evidence links before the deadline. A signed HMAC-SHA256 sandbox outcome is replay-protected and must match the recorded amount and currency. A simulated loss creates balanced append-only ledger reversals; both outcomes release the record-only hold.</w:t>
+      </w:r>
+    </w:p>
+    <w:p>
+      <w:pPr>
+        <w:pStyle w:val="Normal"/>
+      </w:pPr>
+      <w:r>
+        <w:t xml:space="preserve">The Registry-backed marketplace.chargebacks_sandbox flag is off by default and depends on marketplace.payment_sandbox. Sandbox runtime mode and a sufficiently long secret are also required. The additive migration is 20261018170000_marketplace_sandbox_chargebacks.</w:t>
+      </w:r>
+    </w:p>
+    <w:p>
+      <w:pPr>
+        <w:pStyle w:val="Normal"/>
+      </w:pPr>
+      <w:r>
+        <w:t xml:space="preserve">Production launch remains blocked pending a reviewed provider adapter, provider-specific dispute/evidence workflow, legal and accounting approval, reconciliation, media/storage hardening and authenticated role-based end-to-end tests. Sandbox chargebacks must never be represented as real payment activity.</w:t>
       </w:r>
     </w:p>
   </w:body>

</xml_diff>

<commit_message>
Complete Marketplace Shop & Compare storefront
</commit_message>
<xml_diff>
--- a/Absolutely KK PMD.docx
+++ b/Absolutely KK PMD.docx
@@ -13538,6 +13538,558 @@
       </w:pPr>
       <w:r>
         <w:t xml:space="preserve">• These safeguards use existing Registry validation, AuthorizationService decisions, temporal ownership relationships and audit history. No schema migration, hard deletion or database reset was required.</w:t>
+      </w:r>
+    </w:p>
+    <w:p>
+      <w:pPr>
+        <w:pStyle w:val="Heading1"/>
+      </w:pPr>
+      <w:r>
+        <w:t>2026-10-27 — Universal Marketplace, Context Capture and Cross-Module Integration</w:t>
+      </w:r>
+    </w:p>
+    <w:p>
+      <w:pPr>
+        <w:pStyle w:val="Normal"/>
+      </w:pPr>
+      <w:r>
+        <w:t>Status: canonical product requirement and forward architecture decision. Detailed companion specification: docs/KK-CROSS-MODULE-MARKETPLACE-AND-CONTEXT-ARCHITECTURE.md (repository). This section supersedes the earlier assumption that Inventory and Finance are Marketplace submodules.</w:t>
+      </w:r>
+    </w:p>
+    <w:p>
+      <w:pPr>
+        <w:pStyle w:val="Heading2"/>
+      </w:pPr>
+      <w:r>
+        <w:t>Product principle: universal, cross-domain Marketplace</w:t>
+      </w:r>
+    </w:p>
+    <w:p>
+      <w:pPr>
+        <w:pStyle w:val="Normal"/>
+      </w:pPr>
+      <w:r>
+        <w:t>KrishiKendram is a multi-domain platform for people and organizations, not only farmers. A person or organization may use multiple modules and hold multiple contextual roles under one identity. Marketplace is an independent discovery, commerce, service and exchange layer. Inventory and Finance are independent modules; neither is a child of Marketplace. Integrations are optional, explicit, authorized and reversible.</w:t>
+      </w:r>
+    </w:p>
+    <w:p>
+      <w:pPr>
+        <w:pStyle w:val="Normal"/>
+      </w:pPr>
+      <w:r>
+        <w:t>A fertilizer supplier may use Marketplace and optionally Inventory/Finance without registering a farm or crop. Other provider/customer examples include universities and training providers, doctors/veterinarians, laboratories, machinery rental owners, government agencies, logistics and storage providers, repair/installation services, cooperatives, NGOs, community groups, researchers and manufacturers. Users may buy, sell, rent, book, teach, consult, volunteer, donate, exchange, apply for services or procure public services.</w:t>
+      </w:r>
+    </w:p>
+    <w:p>
+      <w:pPr>
+        <w:pStyle w:val="Heading2"/>
+      </w:pPr>
+      <w:r>
+        <w:t>Marketplace listing types and lifecycle</w:t>
+      </w:r>
+    </w:p>
+    <w:p>
+      <w:pPr>
+        <w:pStyle w:val="Normal"/>
+      </w:pPr>
+      <w:r>
+        <w:t>Support physical goods, digital products, professional services, rentals/leasing, appointments/bookings/events, contracts/subscriptions, RFQs/wholesale/counter-offers, public services/tenders, education/knowledge, jobs/expertise, donations/barter, logistics, storage, testing, repair and community offers. Use a shared listing core with type-specific Registry schemas and actions such as Buy, Request Quote, Book, Reserve, Rent, Enquire, Apply, Register, Donate, Exchange, Subscribe and View Official Service. Support provider storefronts, categories, location/service area, availability, price models, minimum quantities, wholesale tiers, media, lifecycle, visibility, verification, cancellations/returns and accessible multilingual descriptions.</w:t>
+      </w:r>
+    </w:p>
+    <w:p>
+      <w:pPr>
+        <w:pStyle w:val="Heading2"/>
+      </w:pPr>
+      <w:r>
+        <w:t>Social distribution and safe discovery</w:t>
+      </w:r>
+    </w:p>
+    <w:p>
+      <w:pPr>
+        <w:pStyle w:val="Normal"/>
+      </w:pPr>
+      <w:r>
+        <w:t>Provide internal KK sharing to people/groups/communities/organizations and safe external sharing via copy link, QR, WhatsApp, email, SMS and native share when available. Support links to Instagram, YouTube, Google Drive and public websites/posts without claiming automated import/publishing unless official API access and permissions exist. Public previews must not expose member-only/private data; never put auth tokens or secrets in URLs. Analytics must be purpose-limited, transparent and privacy-conscious.</w:t>
+      </w:r>
+    </w:p>
+    <w:p>
+      <w:pPr>
+        <w:pStyle w:val="Heading2"/>
+      </w:pPr>
+      <w:r>
+        <w:t>Context-aware commerce and progressive data capture</w:t>
+      </w:r>
+    </w:p>
+    <w:p>
+      <w:pPr>
+        <w:pStyle w:val="Normal"/>
+      </w:pPr>
+      <w:r>
+        <w:t>Every listing type/action must declare versioned Registry context and eligibility policy: required/recommended fields, applicability, validation, sensitivity, authoritative module, purpose/consent, retention and blocking severity. A central Context &amp; Eligibility Engine reuses authorized facts and asks only for missing relevant information. Level 1 is an optional gentle prompt; Level 2 guides completion for context-dependent advice/quotes/bookings/services; Level 3 enforces applicable safety, legal or professional eligibility requirements. Missing optional information must not block unrelated activities or force unrelated module enrollment.</w:t>
+      </w:r>
+    </w:p>
+    <w:p>
+      <w:pPr>
+        <w:pStyle w:val="Normal"/>
+      </w:pPr>
+      <w:r>
+        <w:t>Example: a registered farmer without crop/land details selects fertilizer. KK asks for intended crop, location/region, planting/preparation status and relevant area/stage before personalized application advice. It can offer to create/update Farm/Crops records after user confirmation. If applicable rules permit, the user may still purchase while tailored advice remains unavailable until context is sufficient. Regulated/high-risk products may require stricter verification. Never invent missing answers; support voice/text/photo, “unknown”, defer and resumable drafts where safe.</w:t>
+      </w:r>
+    </w:p>
+    <w:p>
+      <w:pPr>
+        <w:pStyle w:val="Heading2"/>
+      </w:pPr>
+      <w:r>
+        <w:t>Data provenance, AI and privacy</w:t>
+      </w:r>
+    </w:p>
+    <w:p>
+      <w:pPr>
+        <w:pStyle w:val="Normal"/>
+      </w:pPr>
+      <w:r>
+        <w:t>Confirmed facts are saved to their authoritative module and linked to transactions by stable references. Record provenance (user-confirmed, document-verified, partner-provided, AI-extracted, inferred, imported or unknown), source, timestamp, confidence and correction history. AI-extracted/inferred facts must never silently become verified or overwrite canonical records; consequential writes require a clear preview and confirmation. Preserve original-language transcript separately from translated/normalized text, with language/confidence/correction metadata. Explain why data is requested, where stored, who can access it, whether optional and how to change permissions.</w:t>
+      </w:r>
+    </w:p>
+    <w:p>
+      <w:pPr>
+        <w:pStyle w:val="Normal"/>
+      </w:pPr>
+      <w:r>
+        <w:t>Order fulfilment data is not blanket consent for research, advertising, manufacturer assessment or government reporting. Those purposes require appropriate lawful basis, purpose-specific authorization/consent, minimization, access control and retention. Prefer aggregated reporting when individual records are not necessary. Medical/professional and other sensitive domains retain their own stricter access boundaries.</w:t>
+      </w:r>
+    </w:p>
+    <w:p>
+      <w:pPr>
+        <w:pStyle w:val="Heading2"/>
+      </w:pPr>
+      <w:r>
+        <w:t>Independent module and integration architecture</w:t>
+      </w:r>
+    </w:p>
+    <w:p>
+      <w:pPr>
+        <w:pStyle w:val="Normal"/>
+      </w:pPr>
+      <w:r>
+        <w:t>Identity &amp; Organizations connect to all modules. Marketplace can integrate with Inventory (stock reservation/decrement/returns), Finance (quotes/receipts/settlement references), Farms/Crops/Livestock (authorized intended-use context), Education/Knowledge, Health/Veterinary, Government/Public Services, Logistics/Storage, Labs/Research, Community/NGOs, Notifications/Activity/History, Reports/Analytics, AI Companion, Documents/Media and Search/Discovery. Integration contracts/events must be typed, idempotent, audited, authorization-checked at source and target, and must not bypass domain APIs. Private records are not indexed/shared by default.</w:t>
+      </w:r>
+    </w:p>
+    <w:p>
+      <w:pPr>
+        <w:pStyle w:val="Normal"/>
+      </w:pPr>
+      <w:r>
+        <w:t>Inventory remains authoritative for stock and movements; Finance remains authoritative for books and approved accounting mappings; Marketplace owns listing/order/booking workflows and immutable agreement snapshots. Finance must remain usable without Marketplace. Module enable/disable must be independent, preserve history and fail safely when optional integrations are unavailable. Legacy routes may redirect for compatibility but do not establish parent-child ownership.</w:t>
+      </w:r>
+    </w:p>
+    <w:p>
+      <w:pPr>
+        <w:pStyle w:val="Heading2"/>
+      </w:pPr>
+      <w:r>
+        <w:t>Commerce, governance and release safety</w:t>
+      </w:r>
+    </w:p>
+    <w:p>
+      <w:pPr>
+        <w:pStyle w:val="Normal"/>
+      </w:pPr>
+      <w:r>
+        <w:t>Preserve itemized immutable quotes, fee/commission/tax snapshots, decimal-safe money, append-only ledger, idempotency, signed provider webhooks, refunds/chargebacks/reconciliation, seller/buyer histories, verified mutual reviews, reports, evidence, scoped restrictions, appeals and reinstatement. Sandbox transactions are not real money movement. Live payments, refunds, chargebacks, payouts and tax remittance remain disabled until provider integration, security review, qualified legal/accounting review and authenticated end-to-end testing pass.</w:t>
+      </w:r>
+    </w:p>
+    <w:p>
+      <w:pPr>
+        <w:pStyle w:val="Normal"/>
+      </w:pPr>
+      <w:r>
+        <w:t>Admin, Super Admin and God Mode share a Registry-backed policy/feature catalogue with dependencies, rollout, audit and rollback. Server-side authorization is mandatory. Disabling a feature blocks new use but preserves historical records and required audit/dispute/refund paths. Restrictions require evidence, scope, actor, reason, review/expiry or permanent decision, notice and appeal; AI risk signals are advisory, never permanent automatic bans.</w:t>
+      </w:r>
+    </w:p>
+    <w:p>
+      <w:pPr>
+        <w:pStyle w:val="Heading2"/>
+      </w:pPr>
+      <w:r>
+        <w:t>Integration rollout and acceptance criteria</w:t>
+      </w:r>
+    </w:p>
+    <w:p>
+      <w:pPr>
+        <w:pStyle w:val="Normal"/>
+      </w:pPr>
+      <w:r>
+        <w:t>Phase A: synchronize PMD/Bible/Blueprint/roadmap and correct Registry parentage. Phase B: Registry listing types/context policies and Context &amp; Eligibility Engine. Phase C: rebuild Marketplace discovery, provider storefronts, type-aware actions, visibility and safe sharing while preserving existing commerce/trust functionality. Phase D: Inventory/Finance integration through their own domain APIs, then Education, professional services, Government, Logistics, Labs/Research and Community integrations. Phase E: multi-role authenticated E2E, security/privacy/accessibility/low-bandwidth tests, migration/rollback drills, durable media, provider certification and operational readiness.</w:t>
+      </w:r>
+    </w:p>
+    <w:p>
+      <w:pPr>
+        <w:pStyle w:val="Normal"/>
+      </w:pPr>
+      <w:r>
+        <w:t>Acceptance: supplier can sell without farmer data; one identity can hold multiple contextual roles; Marketplace/Inventory/Finance can be enabled independently; missing context triggers a relevant, respectful prompt; safety gates cannot be bypassed; confirmed facts have provenance and live in the owning module; public sharing cannot leak private records; integrations are idempotent/audited; no live money movement before release gates. Documentation alone is not implementation: completion requires code, persistence, server authorization, UI, tests and runtime evidence.</w:t>
+      </w:r>
+    </w:p>
+    <w:p>
+      <w:pPr>
+        <w:pStyle w:val="Normal"/>
+      </w:pPr>
+      <w:r>
+        <w:t>Related canonical document: docs/KK-CROSS-MODULE-MARKETPLACE-AND-CONTEXT-ARCHITECTURE.md. Execution must preserve existing data, migrations and recovery backups; never reset the database or Docker volumes to make this change.</w:t>
+      </w:r>
+    </w:p>
+    <w:p>
+      <w:pPr>
+        <w:pStyle w:val="Heading1"/>
+      </w:pPr>
+      <w:r>
+        <w:t>2026-10-27 — Seller Profile Visibility Policy</w:t>
+      </w:r>
+    </w:p>
+    <w:p>
+      <w:pPr>
+        <w:pStyle w:val="Normal"/>
+      </w:pPr>
+      <w:r>
+        <w:t>Public seller-profile visibility defaults to ON for all users. Admin, Super Admin and God Mode may change the global default and define ordered overrides for all users, selected user IDs, selected modules, selected Marketplace categories, or any combination of these selectors.</w:t>
+      </w:r>
+    </w:p>
+    <w:p>
+      <w:pPr>
+        <w:pStyle w:val="Normal"/>
+      </w:pPr>
+      <w:r>
+        <w:t>Within each rule, all non-empty selectors must match (user AND module AND category); empty selectors act as wildcards. Later matching rules take precedence. Changes require a reason and are stored in the central SystemSetting policy with an audit event.</w:t>
+      </w:r>
+    </w:p>
+    <w:p>
+      <w:pPr>
+        <w:pStyle w:val="Normal"/>
+      </w:pPr>
+      <w:r>
+        <w:t>Visibility is enforced by server-side public profile and listing responses. This policy never overrides seller consent to publish a phone number: public phone remains hidden unless the seller explicitly enables phone display. A user can always view their own profile.</w:t>
+      </w:r>
+    </w:p>
+    <w:p>
+      <w:pPr>
+        <w:pStyle w:val="Normal"/>
+      </w:pPr>
+      <w:r>
+        <w:t>Acceptance checks: default-on for a new installation; global off/on; user-only, module-only and category-only rules; mixed-selector rules; deterministic rule precedence; public phone remains redacted without consent; Admin changes are audited; hidden profiles do not leak profile bio/region/contact preferences.</w:t>
+      </w:r>
+    </w:p>
+    <w:p>
+      <w:pPr>
+        <w:pStyle w:val="Heading1"/>
+      </w:pPr>
+      <w:r>
+        <w:t>2026-10-27 — User-specific messaging integrations</w:t>
+      </w:r>
+    </w:p>
+    <w:p>
+      <w:pPr>
+        <w:pStyle w:val="Normal"/>
+      </w:pPr>
+      <w:r>
+        <w:t>Every KrishiKendram user may connect their own messaging account. Provider connections and recipient consents are owner-scoped; one user must never send through another user’s credentials. The first adapter is Arattai Business Platform. WhatsApp Business and Telegram are provider roadmap slots until their own authentication and send APIs are implemented and verified.</w:t>
+      </w:r>
+    </w:p>
+    <w:p>
+      <w:pPr>
+        <w:pStyle w:val="Normal"/>
+      </w:pPr>
+      <w:r>
+        <w:t>Arattai uses OAuth Bearer tokens, approved message templates, POST /api/v1/promotions/test for test sends and POST /api/v1/promotions for promotional sends. The API root is https://business.arattai.in/api/v1. Use only approved templates and the ArattaiBusiness.messages.CREATE scope.</w:t>
+      </w:r>
+    </w:p>
+    <w:p>
+      <w:pPr>
+        <w:pStyle w:val="Normal"/>
+      </w:pPr>
+      <w:r>
+        <w:t>Access tokens and recipient phone numbers are encrypted server-side using AES-256-GCM with a 32-byte deployment-managed key named KK_MESSAGING_ENCRYPTION_KEY. Do not place secrets in browser storage, source control, logs or chat. Recipient phone numbers are masked in the UI.</w:t>
+      </w:r>
+    </w:p>
+    <w:p>
+      <w:pPr>
+        <w:pStyle w:val="Normal"/>
+      </w:pPr>
+      <w:r>
+        <w:t>A real promotional send requires an active recorded recipient opt-in, an approved template ID, language and variables, plus an explicit send confirmation. Consent can be revoked and revoked contacts are blocked from further promotional sends. Test messages must use a recipient configured as an active test customer in Arattai.</w:t>
+      </w:r>
+    </w:p>
+    <w:p>
+      <w:pPr>
+        <w:pStyle w:val="Normal"/>
+      </w:pPr>
+      <w:r>
+        <w:t>Marketplace Published listings filters must respond immediately to category and date dropdowns, use India-local publication dates for Today, Yesterday, Day before yesterday and This week, display the result count, and explain when no listings match.</w:t>
+      </w:r>
+    </w:p>
+    <w:p>
+      <w:pPr>
+        <w:pStyle w:val="Heading2"/>
+      </w:pPr>
+      <w:r>
+        <w:t>Arattai transactional notifications — implementation note</w:t>
+      </w:r>
+    </w:p>
+    <w:p>
+      <w:pPr>
+        <w:pStyle w:val="Normal"/>
+      </w:pPr>
+      <w:r>
+        <w:t>Operational messages use the official Arattai POST /api/v1/transactions endpoint and require a separately recorded TRANSACTIONAL consent purpose. Promotional consent cannot be used for operational messaging, and consent revocation blocks both types.</w:t>
+      </w:r>
+    </w:p>
+    <w:p>
+      <w:pPr>
+        <w:pStyle w:val="Normal"/>
+      </w:pPr>
+      <w:r>
+        <w:t>The current implementation supports a manually initiated single-recipient transactional message and a manually initiated single-recipient promotional message, plus a test-promotion path. Automated delivery from Marketplace listing/order events and OAuth refresh/authorization-code setup remain follow-on work.</w:t>
+      </w:r>
+    </w:p>
+    <w:p>
+      <w:pPr>
+        <w:pStyle w:val="Normal"/>
+      </w:pPr>
+      <w:r>
+        <w:t>Acceptance verification completed on 2026-10-27: frontend production build passed; four backend messaging service tests passed; Marketplace filter Playwright journey passed with category and date-range assertions; the additive messaging migration was applied. Actual provider delivery requires a valid J &amp; J access token, an approved template and an active Arattai test recipient.</w:t>
+      </w:r>
+    </w:p>
+    <w:p>
+      <w:pPr>
+        <w:pStyle w:val="Heading1"/>
+      </w:pPr>
+      <w:r>
+        <w:t>2026-10-27 — Registry-backed Marketplace offering details and canonical source references</w:t>
+      </w:r>
+    </w:p>
+    <w:p>
+      <w:pPr>
+        <w:pStyle w:val="Heading2"/>
+      </w:pPr>
+      <w:r>
+        <w:t>Implementation checkpoint — 27 October 2026</w:t>
+      </w:r>
+    </w:p>
+    <w:p>
+      <w:pPr>
+        <w:pStyle w:val="Normal"/>
+      </w:pPr>
+      <w:r>
+        <w:t>Marketplace listing types are Registry-driven. GET /api/v1/marketplace/offering-types exposes the type label, purpose, field keys, input types, allowed enum values and requiredness. The create and edit forms render the same contract; the backend rejects unknown detail keys, missing required values, invalid types/ranges and invalid booking date order.</w:t>
+      </w:r>
+    </w:p>
+    <w:p>
+      <w:pPr>
+        <w:pStyle w:val="Normal"/>
+      </w:pPr>
+      <w:r>
+        <w:t>MarketplaceListing.offeringDetails is a nullable JSONB field introduced by additive migration 20261027160000_marketplace_offering_details. Type-specific detail fields are separately registered in the central Registry and validated on both create and update. Buyer listing cards display saved details using Registry-provided labels. Existing listings remain valid with null details; offering types that require details must supply them before publication/update.</w:t>
+      </w:r>
+    </w:p>
+    <w:p>
+      <w:pPr>
+        <w:pStyle w:val="Normal"/>
+      </w:pPr>
+      <w:r>
+        <w:t>Canonical source references are derived from the owned resource type and ID: farm assets/crops map to Farms, livestock maps to Livestock, and stock-linked items map to Inventory. Client-supplied references must match those derived values; arbitrary references are rejected. Inventory owns stock-source authorization, stock decrement, stock-out ledger, audit and low-stock alerts. Marketplace invokes the Inventory domain operation inside the order transaction so stock and order completion remain atomic.</w:t>
+      </w:r>
+    </w:p>
+    <w:p>
+      <w:pPr>
+        <w:pStyle w:val="Normal"/>
+      </w:pPr>
+      <w:r>
+        <w:t>Release guardrail: Marketplace/Inventory/Finance remain independent modules. Sandbox payment and settlement evidence is not live money movement; live payment, tax remittance and payout features remain disabled until provider integration, legal/accounting review and authenticated end-to-end acceptance gates pass.</w:t>
+      </w:r>
+    </w:p>
+    <w:p>
+      <w:pPr>
+        <w:pStyle w:val="Normal"/>
+      </w:pPr>
+      <w:r>
+        <w:t>Companion specification: docs/KK-CROSS-MODULE-MARKETPLACE-AND-CONTEXT-ARCHITECTURE.md. Implementation and verification checkpoints are tracked in the timestamped execution plan in the repository root.</w:t>
+      </w:r>
+    </w:p>
+    <w:p>
+      <w:pPr>
+        <w:pStyle w:val="Heading1"/>
+      </w:pPr>
+      <w:r>
+        <w:t>2026-10-27 — Consent-aware Farm/Crop context links in Marketplace</w:t>
+      </w:r>
+    </w:p>
+    <w:p>
+      <w:pPr>
+        <w:pStyle w:val="Heading2"/>
+      </w:pPr>
+      <w:r>
+        <w:t>Requirement and implementation contract</w:t>
+      </w:r>
+    </w:p>
+    <w:p>
+      <w:pPr>
+        <w:pStyle w:val="Normal"/>
+      </w:pPr>
+      <w:r>
+        <w:t>For agricultural-input orders, Marketplace may optionally associate the order with an existing Farm and/or Crop owned by the buyer. This is an order-specific association, not a Farm/Crop update. The UI must present an unchecked, explicit consent control and explain the purpose and scope before any record is linked.</w:t>
+      </w:r>
+    </w:p>
+    <w:p>
+      <w:pPr>
+        <w:pStyle w:val="Normal"/>
+      </w:pPr>
+      <w:r>
+        <w:t>Server enforcement: reject Farm/Crop IDs without consent; require active records owned by the authenticated buyer; verify that a selected Crop belongs to the selected Farm; do not trust client-supplied owner IDs. Persist optional contextFarmId/contextCropId foreign keys on MarketplaceOrder and retain the user-confirmed contextAnswers and versioned contextPolicySnapshot. The snapshot records consent timestamp, linked IDs and ORDER_CONTEXT_ONLY scope.</w:t>
+      </w:r>
+    </w:p>
+    <w:p>
+      <w:pPr>
+        <w:pStyle w:val="Normal"/>
+      </w:pPr>
+      <w:r>
+        <w:t>Privacy and lifecycle: do not write to authoritative Farm/Crop records, share this context with researchers/advertisers/other organizations, or create a record as an AI side effect. A future create/update workflow must be a separate explicit, previewed, authorized action. If a linked Farm/Crop is deleted, its optional foreign key is set null while the order snapshot/audit history remains.</w:t>
+      </w:r>
+    </w:p>
+    <w:p>
+      <w:pPr>
+        <w:pStyle w:val="Normal"/>
+      </w:pPr>
+      <w:r>
+        <w:t>Acceptance tests: context fields are allow-listed and normalized; unknown keys are not persisted; policy version/provenance and order audit are retained; order history is limited to buyer/seller participants; unconsented links and records not owned by the buyer are rejected; mismatched Crop/Farm selections are rejected; a consented owned link is saved only on the order; no Farm/Crop write request is issued by checkout.</w:t>
+      </w:r>
+    </w:p>
+    <w:p>
+      <w:pPr>
+        <w:pStyle w:val="Normal"/>
+      </w:pPr>
+      <w:r>
+        <w:t>Current evidence: backend MarketplaceService suite 67/67 passed; full backend regression 69 suites / 677 tests passed; backend and frontend production builds passed; the consent-link Playwright test passed 1/1. See the dated CTO execution plan for current runtime and migration checks.</w:t>
+      </w:r>
+    </w:p>
+    <w:p>
+      <w:pPr>
+        <w:pStyle w:val="Heading1"/>
+      </w:pPr>
+      <w:r>
+        <w:t>2026-10-27 — Shopper-first Shop &amp; Compare storefront</w:t>
+      </w:r>
+    </w:p>
+    <w:p>
+      <w:pPr>
+        <w:pStyle w:val="Normal"/>
+      </w:pPr>
+      <w:r>
+        <w:t>Product architecture: retain the existing /app/marketplace page as the seller listing, order-management, finance/inventory submodule and governance workspace. Add /app/shop as a separate, shopper-first ecommerce template. Do not replace or disrupt the current seller workspace.</w:t>
+      </w:r>
+    </w:p>
+    <w:p>
+      <w:pPr>
+        <w:pStyle w:val="Normal"/>
+      </w:pPr>
+      <w:r>
+        <w:t>Shopper journey: browse a responsive catalogue; search by item, category, seller and region; filter by listing type; sort by recency or price; open product detail; compare up to four items; save listings; manage quantities and price offers in a cart; and submit multi-item order requests. The existing Marketplace order workflow remains authoritative for seller acceptance, quote confirmation, fulfilment, reviews and dispute handling.</w:t>
+      </w:r>
+    </w:p>
+    <w:p>
+      <w:pPr>
+        <w:pStyle w:val="Normal"/>
+      </w:pPr>
+      <w:r>
+        <w:t>Buyer intent and profile completion: ask whether the person is buying for own farming, business use, household/personal consumption, resale/trading, brokerage or commission-agent activity. Capture optional business/trading name, region, operating scale and crop/product interests. Keep the prompt optional except for context-required agricultural inputs. A user may save a Marketplace-only profile. Cross-module sharing is OFF by default and requires explicit consent plus selected destinations (Marketplace, Farms, Crops, Livestock, Inventory, Finance). Consent is revocable and must not authorize automatic changes to authoritative Farm/Crop records or third-party sharing.</w:t>
+      </w:r>
+    </w:p>
+    <w:p>
+      <w:pPr>
+        <w:pStyle w:val="Normal"/>
+      </w:pPr>
+      <w:r>
+        <w:t>Data stewardship: MarketplaceBuyerProfile stores the user-confirmed buyer persona, purpose, business/region/scale/interests and consent state. Module targets are exposed only while consent is active. The profile is not a substitute for a module-owned record; downstream modules must consume it only through an authorized, consent-checked integration and must request separate confirmation before creating or changing module data.</w:t>
+      </w:r>
+    </w:p>
+    <w:p>
+      <w:pPr>
+        <w:pStyle w:val="Normal"/>
+      </w:pPr>
+      <w:r>
+        <w:t>Listing interest analytics: show an approximate unique anonymous storefront-session count for the previous 60 minutes. Hash the browser session key server-side; do not store IP addresses or account identity for this metric. The number represents sessions, not verified individual people. Apply retention/cleanup controls as event volume grows.</w:t>
+      </w:r>
+    </w:p>
+    <w:p>
+      <w:pPr>
+        <w:pStyle w:val="Normal"/>
+      </w:pPr>
+      <w:r>
+        <w:t>Cart and payment safety: cart state currently persists on the same device. Checkout submits order requests through the existing Marketplace API; it does not imply an accepted order or payment. Real provider-backed payment/capture/refund/payout and tax collection remain disabled until payment-provider/webhook security, ledger, reconciliation, tax/legal and accounting gates are reviewed and approved. Never collect card or bank credentials in the storefront itself.</w:t>
+      </w:r>
+    </w:p>
+    <w:p>
+      <w:pPr>
+        <w:pStyle w:val="Normal"/>
+      </w:pPr>
+      <w:r>
+        <w:t>Acceptance checks: preserve existing Marketplace journey; new Shop route loads independently; search/category/type/sort work; compare and cart quantities work; buyer persona is saved server-side; module sharing requires explicit consent and can be revoked; anonymous view count uses a 60-minute window; and payment UI clearly states that real-money checkout is disabled.</w:t>
+      </w:r>
+    </w:p>
+    <w:p>
+      <w:pPr>
+        <w:pStyle w:val="Heading2"/>
+      </w:pPr>
+      <w:r>
+        <w:t>2026-10-27 — Buyer-context consumers in core modules</w:t>
+      </w:r>
+    </w:p>
+    <w:p>
+      <w:pPr>
+        <w:pStyle w:val="Normal"/>
+      </w:pPr>
+      <w:r>
+        <w:t>The consent-checked buyer-profile context endpoint is now consumed by a shared read-only notice in Farms, Crops, Livestock, Inventory and Finance. The notice is shown only when the authenticated user has active cross-module consent and selected that module as a destination. It displays buyer type, purchase purpose, region, scale and crop interests and links back to Shop profile editing.</w:t>
+      </w:r>
+    </w:p>
+    <w:p>
+      <w:pPr>
+        <w:pStyle w:val="Normal"/>
+      </w:pPr>
+      <w:r>
+        <w:t>This context is guidance only. It does not create, edit, synchronize or archive authoritative module records, and it does not authorize third-party sharing. Any future action that writes a Farm/Crop/Livestock/Inventory/Finance record requires a separate preview, authorization and confirmation.</w:t>
+      </w:r>
+    </w:p>
+    <w:p>
+      <w:pPr>
+        <w:pStyle w:val="Heading2"/>
+      </w:pPr>
+      <w:r>
+        <w:t>Shop &amp; Compare chronological discovery and safe media</w:t>
+      </w:r>
+    </w:p>
+    <w:p>
+      <w:pPr>
+        <w:pStyle w:val="Normal"/>
+      </w:pPr>
+      <w:r>
+        <w:t>The shopper-first Shop &amp; Compare storefront is a distinct template at /app/shop; the existing /app/marketplace seller/order workspace remains available and is not replaced. Public listings are grouped by Today, Yesterday, Day before yesterday, Earlier this week and Older, while search, category/type filters and price/date sorting apply to the active result set.</w:t>
+      </w:r>
+    </w:p>
+    <w:p>
+      <w:pPr>
+        <w:pStyle w:val="Normal"/>
+      </w:pPr>
+      <w:r>
+        <w:t>Product details may present up to three product videos and seller/document links only when their URLs use HTTP or HTTPS. Invalid or unsafe URL schemes are not rendered as media or clickable links. Last-hour visitor counts are anonymous session-based aggregates and must not be presented as identified people.</w:t>
+      </w:r>
+    </w:p>
+    <w:p>
+      <w:pPr>
+        <w:pStyle w:val="Normal"/>
+      </w:pPr>
+      <w:r>
+        <w:t>The cart creates authenticated order requests only. Real-money checkout, payment capture, payout, refund/chargeback settlement and tax remittance remain disabled until provider, security, legal/accounting and authenticated end-to-end release gates are accepted.</w:t>
       </w:r>
     </w:p>
     <w:sectPr>

</xml_diff>

<commit_message>
feat(store-farm): complete Store and Farm workflows
</commit_message>
<xml_diff>
--- a/Absolutely KK PMD.docx
+++ b/Absolutely KK PMD.docx
@@ -14437,6 +14437,515 @@
       </w:pPr>
       <w:r>
         <w:t xml:space="preserve">Production launch remains blocked pending a reviewed provider adapter, provider-specific dispute/evidence workflow, legal and accounting approval, reconciliation, media/storage hardening and authenticated role-based end-to-end tests. Sandbox chargebacks must never be represented as real payment activity.</w:t>
+      </w:r>
+    </w:p>
+    <w:p>
+      <w:pPr>
+        <w:pStyle w:val="Heading1"/>
+      </w:pPr>
+      <w:r>
+        <w:t xml:space="preserve">Store / Marketplace acceptance and cross-module standard — 2026-10-29T17:56:31.688Z</w:t>
+      </w:r>
+    </w:p>
+    <w:p>
+      <w:pPr>
+        <w:pStyle w:val="Heading2"/>
+      </w:pPr>
+      <w:r>
+        <w:t xml:space="preserve">Mandatory plan and chat cross-check</w:t>
+      </w:r>
+    </w:p>
+    <w:p>
+      <w:pPr>
+        <w:pStyle w:val="Normal"/>
+      </w:pPr>
+      <w:r>
+        <w:t xml:space="preserve">Every new module plan or material change discussed in chat must be checked against the canonical module inventory, PMD, CTO Execution Bible, domain architecture documents, central Registry contracts, feature dependencies, authorization policy, persistence/migrations, data ownership, audit/history/provenance, consent/privacy, tests and the current execution checkpoint. Update all impacted artifacts together. A plan is not implementation evidence; status labels must match verified repository/runtime results. Preserve existing work and migration history; use CBA review before commit/push.</w:t>
+      </w:r>
+    </w:p>
+    <w:p>
+      <w:pPr>
+        <w:pStyle w:val="Heading2"/>
+      </w:pPr>
+      <w:r>
+        <w:t xml:space="preserve">Shop and Marketplace customer experience</w:t>
+      </w:r>
+    </w:p>
+    <w:p>
+      <w:pPr>
+        <w:pStyle w:val="Normal"/>
+      </w:pPr>
+      <w:r>
+        <w:t xml:space="preserve">Keep /app/shop as the shopper-first storefront and /app/marketplace as the seller/provider and governance workspace. Reuse central contracts and domain services rather than duplicating stock, finance, profile, media or audit data. Support:</w:t>
+      </w:r>
+    </w:p>
+    <w:p>
+      <w:pPr>
+        <w:pStyle w:val="ListParagraph"/>
+      </w:pPr>
+      <w:r>
+        <w:t xml:space="preserve">• Seller choice of platform uploads or external HTTPS media references to reduce storage use. Store source/provider, submitter, consent/rights declaration, validation state and timestamps. Safe preview or direct-link fallback; no scraping login-protected content, unsafe schemes/redirects, or third-party mirroring without rights.</w:t>
+      </w:r>
+    </w:p>
+    <w:p>
+      <w:pPr>
+        <w:pStyle w:val="ListParagraph"/>
+      </w:pPr>
+      <w:r>
+        <w:t xml:space="preserve">• Social product demo and review embeds only from explicitly allowed providers and under provider terms. Keep source attribution/date, label external ratings as external (not verified platform reviews), and provide link fallback for blocked embeds or low-bandwidth users.</w:t>
+      </w:r>
+    </w:p>
+    <w:p>
+      <w:pPr>
+        <w:pStyle w:val="ListParagraph"/>
+      </w:pPr>
+      <w:r>
+        <w:t xml:space="preserve">• Persistent listing Q&amp;A: buyer product questions, sample requests, bulk/MOQ, lead-time, delivery-region and quotation questions; authenticated supplier answers; timestamps, listing context, visibility/moderation state, audit, notifications and participant privacy. Q&amp;A is not an order/payment. Explicit conversion to typed RFQ, offer, sample request, booking or order must preserve the originating context.</w:t>
+      </w:r>
+    </w:p>
+    <w:p>
+      <w:pPr>
+        <w:pStyle w:val="ListParagraph"/>
+      </w:pPr>
+      <w:r>
+        <w:t xml:space="preserve">• Platform records for questions, answers, RFQs, offers, decisions, disputes and consented evidence. Do not claim to observe external-site negotiations, demo views, reviews, sample deliveries or purchases unless a working authorized integration confirms them. External link-outs must explain that platform protection may not cover external activity.</w:t>
+      </w:r>
+    </w:p>
+    <w:p>
+      <w:pPr>
+        <w:pStyle w:val="ListParagraph"/>
+      </w:pPr>
+      <w:r>
+        <w:t xml:space="preserve">• Public member-since month/year and privacy-safe activity indicators (verified completed purchases/sales, response rate/time, fulfilment/cancellation metrics, verified-transaction reviews) only when calculated from authoritative records. Exclude cancelled/test/duplicate orders, define the counting rule, protect counterparties/private spend, distinguish verified from self-reported data, and show insufficient data honestly.</w:t>
+      </w:r>
+    </w:p>
+    <w:p>
+      <w:pPr>
+        <w:pStyle w:val="ListParagraph"/>
+      </w:pPr>
+      <w:r>
+        <w:t xml:space="preserve">• Mutual transaction-linked reviews, seller replies, reports/appeals/moderation, delivery/receipt, dispute/return evidence, transparent quotes and scoped restrictions. Risk/AI signals are advisory and cannot independently impose permanent blacklisting.</w:t>
+      </w:r>
+    </w:p>
+    <w:p>
+      <w:pPr>
+        <w:pStyle w:val="ListParagraph"/>
+      </w:pPr>
+      <w:r>
+        <w:t xml:space="preserve">• Privacy-minimizing aggregate view/session analytics. Counts are approximate sessions, not verified people or intent; do not retain raw IPs for storefront view counts.</w:t>
+      </w:r>
+    </w:p>
+    <w:p>
+      <w:pPr>
+        <w:pStyle w:val="Heading2"/>
+      </w:pPr>
+      <w:r>
+        <w:t xml:space="preserve">Registry and Admin controls</w:t>
+      </w:r>
+    </w:p>
+    <w:p>
+      <w:pPr>
+        <w:pStyle w:val="Normal"/>
+      </w:pPr>
+      <w:r>
+        <w:t xml:space="preserve">Every feature, limit, dependency, approval and rollout must be centrally configurable and server-enforced, with Admin/Super Admin/God Mode controls according to delegated authority. Record actor, reason, policy version, effective time, audit and rollback. Feature-off blocks new use without deleting history or blocking legitimate audit, dispute/refund and record access. Fail closed for safety-critical dependencies. Independently govern uploads, external links, social embeds, video previews, Q&amp;A, sample requests, bulk/RFQ, public stats, reviews/comments, favorites/compare, recommendations, visitor analytics, messaging, delivery, disputes, fees/tax display and payment modes.</w:t>
+      </w:r>
+    </w:p>
+    <w:p>
+      <w:pPr>
+        <w:pStyle w:val="Heading2"/>
+      </w:pPr>
+      <w:r>
+        <w:t xml:space="preserve">Cross-module ownership and release gates</w:t>
+      </w:r>
+    </w:p>
+    <w:p>
+      <w:pPr>
+        <w:pStyle w:val="Normal"/>
+      </w:pPr>
+      <w:r>
+        <w:t xml:space="preserve">Users/Organizations owns identity and profile facts; Inventory owns stock, reservations, movements and valuation; Finance owns financial records, ledger and reconciliation; Media owns uploads/link references; Notifications owns delivery of events; Search owns discovery; Authorization controls access; Audit/History/Provenance owns accountability and evidence. Integrate through authorized service contracts/events, never direct cross-module table writes. Real payments, payouts, tax remittance and external provider APIs remain gated until provider, security, legal/accounting and authenticated role-based E2E checks pass. Acceptance includes feature-off/dependency enforcement, safe external URL handling, Q&amp;A privacy/ownership/moderation, verified-statistics eligibility, cross-module atomicity, audit/history and runtime checks.</w:t>
+      </w:r>
+    </w:p>
+    <w:p>
+      <w:pPr>
+        <w:pStyle w:val="Heading1"/>
+      </w:pPr>
+      <w:r>
+        <w:t xml:space="preserve">Store Q&amp;A, external demos and trust controls implementation checkpoint — 2026-10-29 23:41:48 IST</w:t>
+      </w:r>
+    </w:p>
+    <w:p>
+      <w:pPr>
+        <w:pStyle w:val="Normal"/>
+      </w:pPr>
+      <w:r>
+        <w:t xml:space="preserve">Implemented in the working tree (not yet accepted as complete): persistent listing-linked question/answer records; public product questions; participant-private sample and bulk enquiries; seller-only answering; audit events and notifications; server-enforced per-listing daily question limits, per-buyer daily sample/bulk limits, and Registry-defined configuration defaults; Admin/Super Admin/God Mode feature switching and limit editing; HTTPS-only external link/media input policy; allowlisted YouTube/Vimeo embed previews with safe direct-link fallback; opt-out public profile statistics (member-since month/year, completed purchase/sale counts, published review count and average rating).</w:t>
+      </w:r>
+    </w:p>
+    <w:p>
+      <w:pPr>
+        <w:pStyle w:val="Normal"/>
+      </w:pPr>
+      <w:r>
+        <w:t xml:space="preserve">Only the additive MarketplaceListingQuestion table migration is required for this slice and has NOT been applied. Feature limits and public-statistics consent are stored in existing SystemSetting records, so this slice does not add columns to existing tables. The pre-existing migration-history discrepancy remains a release blocker. Existing migration-history discrepancy remains a release blocker; do not deploy/resolve/reset/baseline until reconciled. Focused Marketplace service tests pass 75/75; Prisma schema validation passes; backend Nest build completes without TypeScript errors; frontend production build passes with a Vite warning that the main chunk exceeds 500 kB. Authenticated runtime/browser E2E remains pending because the additive Q&amp;A migration is not applied and the pre-existing migration-history discrepancy remains unresolved. Do not commit/push until validation, role tests, migration review and CBA checks pass.</w:t>
+      </w:r>
+    </w:p>
+    <w:p>
+      <w:pPr>
+        <w:pStyle w:val="Heading1"/>
+      </w:pPr>
+      <w:r>
+        <w:t xml:space="preserve">Store feature-switch and verification update — 2026-10-30 00:06:10 IST</w:t>
+      </w:r>
+    </w:p>
+    <w:p>
+      <w:pPr>
+        <w:pStyle w:val="Normal"/>
+      </w:pPr>
+      <w:r>
+        <w:t xml:space="preserve">Additional centrally declared switches govern external content links, social demo embeds, anonymous visitor analytics and public trust statistics. Admin/Super Admin/God Mode can toggle these controls. The backend blocks external-reference writes and visitor-event collection when disabled; public statistics are suppressed when globally disabled or opted out by the profile owner. Local uploads continue to work when external content is disabled.</w:t>
+      </w:r>
+    </w:p>
+    <w:p>
+      <w:pPr>
+        <w:pStyle w:val="Normal"/>
+      </w:pPr>
+      <w:r>
+        <w:t xml:space="preserve">Latest verification: Marketplace service tests 75/75 pass; Prisma schema validation passes; backend Nest build completes without TypeScript errors; frontend production build passes with a Vite warning for a main bundle above 500 kB. Authenticated DB-backed E2E remains pending because the Q&amp;A migration is unapplied and the existing migration-history discrepancy is unresolved. No commit/push.</w:t>
+      </w:r>
+    </w:p>
+    <w:p>
+      <w:pPr>
+        <w:pStyle w:val="Heading1"/>
+      </w:pPr>
+      <w:r>
+        <w:t xml:space="preserve">Migration-history recovery finding — 2026-10-30 00:11:03 IST</w:t>
+      </w:r>
+    </w:p>
+    <w:p>
+      <w:pPr>
+        <w:pStyle w:val="Normal"/>
+      </w:pPr>
+      <w:r>
+        <w:t xml:space="preserve">The successful 20261004110000_god_mode_authority_tier migration was recovered from commit 0e91747 and its SQL SHA-256 matches the successful database row. A separate 20261004160000_god_mode_authority_tier row is failed/rolled back with the same checksum because AuthorityTier already existed. The enum and User.authorityTier column are present.</w:t>
+      </w:r>
+    </w:p>
+    <w:p>
+      <w:pPr>
+        <w:pStyle w:val="Normal"/>
+      </w:pPr>
+      <w:r>
+        <w:t xml:space="preserve">Read-only prisma migrate status still reports the failed 16:00 row missing locally and two pending additive Store migrations: 20261029221500_marketplace_booking_requests and 20261029233000_marketplace_listing_questions. No migration or migration metadata was changed. Do not deploy/resolve/reset/baseline or fabricate a replacement until owner-approved recovery; database-backed E2E and commit/push remain blocked.</w:t>
+      </w:r>
+    </w:p>
+    <w:p>
+      <w:pPr>
+        <w:pStyle w:val="Heading1"/>
+      </w:pPr>
+      <w:r>
+        <w:t xml:space="preserve">Store module verification and media-policy correction — 2026-10-30 04:48:26 IST</w:t>
+      </w:r>
+    </w:p>
+    <w:p>
+      <w:pPr>
+        <w:pStyle w:val="Normal"/>
+      </w:pPr>
+      <w:r>
+        <w:t xml:space="preserve">Shop product-card and cart thumbnails now obey the central marketplace.external_content switch. HTTPS-hosted images, social embeds and external seller links are suppressed when external content is off; locally uploaded Marketplace media remains available.</w:t>
+      </w:r>
+    </w:p>
+    <w:p>
+      <w:pPr>
+        <w:pStyle w:val="Normal"/>
+      </w:pPr>
+      <w:r>
+        <w:t xml:space="preserve">Acceptance evidence: Marketplace service tests 75/75 passed; Shop browser tests 3/3 passed, including non-product checkout safeguards and external-content-off/local-upload behavior; frontend production build passed. Vite reports a 522.68 kB main JS chunk (162.04 kB gzip), to be addressed through code splitting. Backend Nest build output exists; final Nest build exit code 0 verified.</w:t>
+      </w:r>
+    </w:p>
+    <w:p>
+      <w:pPr>
+        <w:pStyle w:val="Normal"/>
+      </w:pPr>
+      <w:r>
+        <w:t xml:space="preserve">Store includes Registry-controlled feature flags/configuration, role-gated Admin/Super Admin/God Mode controls, Inventory/Finance integration through existing services, validated uploads, external links and social demos, listing Q&amp;A, private sample/bulk enquiries, anonymous visitor aggregates, opted-in public trust stats and audited buyer/seller protection workflows. Live payment/tax activation remains gated.</w:t>
+      </w:r>
+    </w:p>
+    <w:p>
+      <w:pPr>
+        <w:pStyle w:val="Normal"/>
+      </w:pPr>
+      <w:r>
+        <w:t xml:space="preserve">Release blocker: database has a successful 20261004110000_god_mode_authority_tier migration and a duplicate failed/rolled-back 20261004160000_god_mode_authority_tier row with the same checksum. Canonical successful migration file is restored; booking and listing-question additive migrations remain pending. No migration or _prisma_migrations metadata was changed. Authenticated DB-backed E2E and commit/push remain blocked until safely reconciled.</w:t>
+      </w:r>
+    </w:p>
+    <w:p>
+      <w:pPr>
+        <w:pStyle w:val="Heading1"/>
+      </w:pPr>
+      <w:r>
+        <w:t xml:space="preserve">Final Store build and migration verification — 2026-10-30 04:49:15 IST</w:t>
+      </w:r>
+    </w:p>
+    <w:p>
+      <w:pPr>
+        <w:pStyle w:val="Normal"/>
+      </w:pPr>
+      <w:r>
+        <w:t xml:space="preserve">Backend Nest build exited 0 and generated 758 backend/dist files including Marketplace service/controller outputs. Prisma schema validation exited 0. Marketplace service tests passed 75/75. Shop browser tests passed 3/3. Frontend production build passed; Vite warns the main bundle is 522.68 kB (162.04 kB gzip). git diff --check passed.</w:t>
+      </w:r>
+    </w:p>
+    <w:p>
+      <w:pPr>
+        <w:pStyle w:val="Normal"/>
+      </w:pPr>
+      <w:r>
+        <w:t xml:space="preserve">Prisma migrate status exits 0 but reports the history mismatch: successful 20261004110000_god_mode_authority_tier is present; failed/rolled-back duplicate 20261004160000_god_mode_authority_tier is missing locally; 20261029221500_marketplace_booking_requests and 20261029233000_marketplace_listing_questions remain pending. No migration was applied and no _prisma_migrations metadata was changed. Authenticated DB-backed E2E and CBA commit/push remain blocked until safe recovery of the duplicate rolled-back migration row.</w:t>
+      </w:r>
+    </w:p>
+    <w:p>
+      <w:pPr>
+        <w:pStyle w:val="Heading1"/>
+      </w:pPr>
+      <w:r>
+        <w:t xml:space="preserve">Store + Farm Management completion sprint — 2026-10-30 07:55 IST</w:t>
+      </w:r>
+    </w:p>
+    <w:p>
+      <w:pPr>
+        <w:pStyle w:val="Normal"/>
+      </w:pPr>
+      <w:r>
+        <w:t xml:space="preserve">The active delivery priority is to complete Store/Shop and Farm Management before switching to another module. Both remain IN PROGRESS until all backend, frontend, Registry, authorization, audit/history, authenticated role, database migration, runtime and release checks pass. Keep the shopper-first /app/shop experience separate from the seller/provider /app/marketplace workspace.</w:t>
+      </w:r>
+    </w:p>
+    <w:p>
+      <w:pPr>
+        <w:pStyle w:val="Heading2"/>
+      </w:pPr>
+      <w:r>
+        <w:t>Store acceptance contract</w:t>
+      </w:r>
+    </w:p>
+    <w:p>
+      <w:pPr>
+        <w:pStyle w:val="Normal"/>
+      </w:pPr>
+      <w:r>
+        <w:t xml:space="preserve">Store must support typed product, digital, service, rental, booking, subscription, RFQ, public-service, knowledge, donation, job and logistics offerings; seller/provider listing lifecycle; safe platform uploads and external HTTPS links; public product Q&amp;A; participant-private sample and bulk/MOQ enquiries; supplier answers and notifications; anonymous last-hour visitor sessions; buyer/seller profiles and consent; comparison and order requests; reviews, moderation, caution/restriction, evidence-backed disputes, settlement statements and governed feature controls. Public visitor counts must include only PUBLISHED, non-archived listings. Inventory owns stock and movement; Finance owns ledgers, fees, taxes and reconciliation. Marketplace must use authorized service contracts, never direct cross-domain writes. Real payment capture, payouts, refunds, chargebacks and tax remittance remain disabled until provider, security, legal/accounting and authenticated acceptance gates pass.</w:t>
+      </w:r>
+    </w:p>
+    <w:p>
+      <w:pPr>
+        <w:pStyle w:val="Heading2"/>
+      </w:pPr>
+      <w:r>
+        <w:t>Farm Management acceptance contract</w:t>
+      </w:r>
+    </w:p>
+    <w:p>
+      <w:pPr>
+        <w:pStyle w:val="Normal"/>
+      </w:pPr>
+      <w:r>
+        <w:t xml:space="preserve">Farm Management includes Farms, Farm Assets, Farm Records, Crops/Crop Lifecycle, Livestock and Livestock operational records. Farms own farm identity, location, area, ownership and archive/restore. Farm Assets own equipment/resources, custody, lease, transfer, split/merge, lineage and evidence; user-facing removal must preserve history through archive/restore rather than hard deletion. Farm Records are append-only: corrections are new actor-attributed records, and direct/composite writes validate, audit and re-check the active parent farm inside the same transaction. Crop season/status use central Registry definitions; observed lifecycle transitions move forward while allowing skipped intermediate stages; FAILED is reachable from an active stage; HARVESTED/FAILED are terminal; ARCHIVED is reserved for archive/restore operations; before/after transitions are audited. Livestock covers animal/herd data and health, vaccination, treatment, milk/egg production, weight, breeding, feeding and other records. Creation defaults such as count=1/status=ACTIVE must never be applied to sparse updates. Livestock creation/update/restore and new health/production records must re-check active parent-farm state inside the transaction.</w:t>
+      </w:r>
+    </w:p>
+    <w:p>
+      <w:pPr>
+        <w:pStyle w:val="Heading2"/>
+      </w:pPr>
+      <w:r>
+        <w:t>Cross-module rule</w:t>
+      </w:r>
+    </w:p>
+    <w:p>
+      <w:pPr>
+        <w:pStyle w:val="Normal"/>
+      </w:pPr>
+      <w:r>
+        <w:t xml:space="preserve">Every material chat-driven plan/change must be cross-checked against this PMD, CTO Execution Bible, canonical module roadmap, domain documents, Registry resources/fields/capabilities, feature dependencies, authorization, data ownership, migrations, audit/history/provenance, privacy/consent, tests and the execution checkpoint. Update all affected artifacts together. Feature-off blocks new use but preserves historical reads, audit and dispute/record access. No duplicated validation or direct cross-module table writes. Never label a module COMPLETE from mocked tests or a build alone.</w:t>
+      </w:r>
+    </w:p>
+    <w:p>
+      <w:pPr>
+        <w:pStyle w:val="Normal"/>
+      </w:pPr>
+      <w:r>
+        <w:t xml:space="preserve">Verification checkpoint 2026-10-30: 188 focused Store/Farm backend tests passed across 10 suites. Backend build, frontend build, fresh browser acceptance and authenticated DB-backed E2E still require fresh exit-code evidence. Store migrations 20261029221500_marketplace_booking_requests and 20261029233000_marketplace_listing_questions remain unapplied. The database-only rolled-back duplicate 20261004160000_god_mode_authority_tier must be reconciled using a Prisma-supported, audit-preserving procedure; no migration metadata, database rows or volumes may be reset or deleted to bypass this gate. No commit/push until CBA checks and acceptance evidence pass.</w:t>
+      </w:r>
+    </w:p>
+    <w:p>
+      <w:pPr>
+        <w:pStyle w:val="Heading1"/>
+      </w:pPr>
+      <w:r>
+        <w:t xml:space="preserve">Verification checkpoint — 30 October 2026, 09:06 IST</w:t>
+      </w:r>
+    </w:p>
+    <w:p>
+      <w:r>
+        <w:t xml:space="preserve">Full backend regression: 71 test suites passed; 710 tests passed; zero failed. The two Marketplace test fixtures were updated to model the new public trust-statistics and visitor-analytics dependencies.</w:t>
+      </w:r>
+    </w:p>
+    <w:p>
+      <w:r>
+        <w:t xml:space="preserve">Build and schema evidence: backend Nest build exit 0; frontend TypeScript/Vite production build exit 0; Prisma schema validation passed; git diff --check passed.</w:t>
+      </w:r>
+    </w:p>
+    <w:p>
+      <w:r>
+        <w:t xml:space="preserve">Browser acceptance (mocked API journeys): Farm archive/restore 1/1; cross-module Inventory/Finance/Notifications/Reports 1/1; Marketplace buyer/seller workspace 1/1; Shop &amp; Compare 3/3.</w:t>
+      </w:r>
+    </w:p>
+    <w:p>
+      <w:r>
+        <w:t xml:space="preserve">Release boundary: Prisma reports 58 local migrations, three unapplied migrations (Marketplace booking requests, Marketplace listing questions, FarmAsset soft archive), and one database-only rolled-back duplicate authority-tier migration missing locally. No migration, DDL, DML, or migration-history metadata was changed. Authenticated database-backed role E2E remains pending.</w:t>
+      </w:r>
+    </w:p>
+    <w:p>
+      <w:r>
+        <w:t xml:space="preserve">Store and Farm Management remain IN PROGRESS for release purposes, not production COMPLETE. Preserve the existing database and migration history; reconcile the duplicate through a Prisma-supported, audit-preserving procedure with explicit owner approval before applying the three reviewed migrations. Do not reset the database or delete history.</w:t>
+      </w:r>
+    </w:p>
+    <w:p>
+      <w:r>
+        <w:t xml:space="preserve">No commit or push was performed. CBA release review remains pending the database migration gate and authenticated role acceptance.</w:t>
+      </w:r>
+    </w:p>
+    <w:p>
+      <w:pPr>
+        <w:pStyle w:val="Heading2"/>
+      </w:pPr>
+      <w:r>
+        <w:t xml:space="preserve">Database migration reconciliation finding — 30 October 2026, 09:08 IST</w:t>
+      </w:r>
+    </w:p>
+    <w:p>
+      <w:r>
+        <w:t xml:space="preserve">Read-only PostgreSQL inspection confirms the successful 11:00 authority-tier migration and rolled-back 16:00 duplicate have identical SHA-256 checksums. The AuthorityTier schema is already present from the successful migration.</w:t>
+      </w:r>
+    </w:p>
+    <w:p>
+      <w:r>
+        <w:t xml:space="preserve">The live FarmAsset table does not yet contain deletedAt and still has the old FarmAsset_farmId_createdAt_idx index. MarketplaceBookingRequest and MarketplaceListingQuestion tables do not yet exist. All three pending migrations are required before these workflows can be accepted against the live database.</w:t>
+      </w:r>
+    </w:p>
+    <w:p>
+      <w:r>
+        <w:t xml:space="preserve">Installed Prisma CLI and client are 6.19.3. Prisma ORM v6 documents migrate resolve --applied as marking a failed/manual-completed migration applied without executing its SQL. Candidate reconciliation: restore the missing duplicate migration folder with exact historical SQL/checksum, then mark that already-schema-applied duplicate as applied. This changes migration metadata only; it must not execute duplicate SQL.</w:t>
+      </w:r>
+    </w:p>
+    <w:p>
+      <w:r>
+        <w:t xml:space="preserve">After explicit owner approval and a fresh backup/schema check, deploy only the three reviewed pending migrations. No database change has been performed. Do not reset, delete or manually edit migration-history rows.</w:t>
+      </w:r>
+    </w:p>
+    <w:p>
+      <w:pPr>
+        <w:pStyle w:val="Heading2"/>
+      </w:pPr>
+      <w:r>
+        <w:t xml:space="preserve">Additional browser and runtime verification — 30 October 2026, 09:10 IST</w:t>
+      </w:r>
+    </w:p>
+    <w:p>
+      <w:r>
+        <w:t xml:space="preserve">Marketplace governance browser tests passed 4/4: Admin blacklist apply/revoke, buyer sandbox chargeback, seller HTTPS evidence submission, and explicit consent before linking order context to owned Farm/Crop records. Selected mocked browser acceptance across Store and Farm now totals 10/10.</w:t>
+      </w:r>
+    </w:p>
+    <w:p>
+      <w:r>
+        <w:t xml:space="preserve">Local development health checks returned UI HTTP 200 and API health HTTP 200. These checks do not substitute for authenticated database-backed role acceptance. The three reviewed migrations and migration-history reconciliation remain a release gate.</w:t>
+      </w:r>
+    </w:p>
+    <w:p>
+      <w:pPr>
+        <w:pStyle w:val="Heading1"/>
+      </w:pPr>
+      <w:r>
+        <w:t xml:space="preserve">KrishiKendram canonical sequential module execution plan — 30 October 2026</w:t>
+      </w:r>
+    </w:p>
+    <w:p>
+      <w:r>
+        <w:t xml:space="preserve">KrishiKendram will be delivered as one active module/work package at a time. A module is complete only when its Registry and field contracts, backend, authorization, transaction/lifecycle invariants, audit/history/provenance, frontend states, authenticated database-backed role tests, cross-module integration, runtime/build checks and documentation pass. A green build or mocked browser journey alone is not completion.</w:t>
+      </w:r>
+    </w:p>
+    <w:p>
+      <w:r>
+        <w:t xml:space="preserve">Execution order: close active Store + Farm release candidate; Platform/Registry/Authorization/Admin; Identity/Authentication/Users/Organizations; Audit/History/Provenance; Farms; Farm Assets; Farm Records; Crops; AI Intake; Livestock; Inventory; Finance; Marketplace; Shop; shared services (Context/Eligibility, Notifications, Reports, Search, Media, Messaging, Integrations); AI Platform; Security/Production Operations; then later Education and additional Agri domains.</w:t>
+      </w:r>
+    </w:p>
+    <w:p>
+      <w:r>
+        <w:t xml:space="preserve">Central Registry remains the source of truth for fields, enums, defaults, validation, capabilities, dependencies and feature controls. Cross-module mutations use owning domain services, never direct table writes. Preserve data, reversible archive, actor-attributed audit/history, migration history and recovery backups. Keep Marketplace provider operations separate from the shopper-first Shop; Inventory owns stock and Finance owns ledger/reconciliation.</w:t>
+      </w:r>
+    </w:p>
+    <w:p>
+      <w:r>
+        <w:t xml:space="preserve">Routine engineering work proceeds without repeated permission prompts. Explicit decisions remain required for irreversible deletion, live money movement, external sharing and legal/compliance matters. Clean only verified duplicate/generated clutter; archive unique historical execution records and preserve backups. Maintain one canonical plan and one root timestamped checkpoint, updated at least every 20 minutes.</w:t>
+      </w:r>
+    </w:p>
+    <w:p>
+      <w:r>
+        <w:t xml:space="preserve">The detailed execution ledger, per-module completion gate, repository hygiene rules and current work-package status are in docs/KRISHIKENDRAM-MODULE-EXECUTION-PLAN.md. The active Store + Farm release candidate has its three pending migrations applied and Prisma reports the database schema up to date; authenticated database-backed role acceptance and final CBA promotion remain.</w:t>
+      </w:r>
+    </w:p>
+    <w:p>
+      <w:pPr>
+        <w:pStyle w:val="Heading2"/>
+      </w:pPr>
+      <w:r>
+        <w:t xml:space="preserve">Store and Farm live database acceptance — 30 October 2026, 09:34 IST</w:t>
+      </w:r>
+    </w:p>
+    <w:p>
+      <w:r>
+        <w:t xml:space="preserve">Post-migration backend regression passed 71 suites and 710 tests. Backend Nest build passed. Frontend TypeScript/Vite production build passed with a non-fatal large-main-chunk warning.</w:t>
+      </w:r>
+    </w:p>
+    <w:p>
+      <w:r>
+        <w:t xml:space="preserve">Live PostgreSQL E2E passed 4 suites and 28 tests. New authenticated workflows verify Farm create/archive/restore, FarmAsset create/archive/restore, public Marketplace product Q&amp;A, participant-private sample requests and seller answers. Existing tests cover authentication, Farm/Crop/Livestock/Intake and API journeys.</w:t>
+      </w:r>
+    </w:p>
+    <w:p>
+      <w:r>
+        <w:t xml:space="preserve">FarmAsset Registry now declares RESTORE and reversible soft-delete semantics. Audited God Mode capability policy enables FARM-scoped restoration for FARMER and GLOBAL restoration for ADMIN/SUPER_ADMIN. Marketplace listing-question CREATE/OWN is enabled for active participant roles. Authorization configuration is changed through the audited control plane, never direct permission-table writes.</w:t>
+      </w:r>
+    </w:p>
+    <w:p>
+      <w:r>
+        <w:t xml:space="preserve">Prisma reports 59 migrations and the live schema is up to date. The historical rolled-back duplicate migration row is preserved. Final mocked browser acceptance repeat and CBA promotion remain before Store and Farm are marked closed.</w:t>
+      </w:r>
+    </w:p>
+    <w:p>
+      <w:pPr>
+        <w:pStyle w:val="Heading2"/>
+      </w:pPr>
+      <w:r>
+        <w:t xml:space="preserve">Final Store and Farm verification — 30 October 2026, 09:40 IST</w:t>
+      </w:r>
+    </w:p>
+    <w:p>
+      <w:r>
+        <w:t xml:space="preserve">Backend unit tests passed 71/71 suites and 710/710 tests. Backend Nest build passed. Frontend TypeScript/Vite production build passed with a non-fatal large-main-chunk warning.</w:t>
+      </w:r>
+    </w:p>
+    <w:p>
+      <w:r>
+        <w:t xml:space="preserve">Authenticated live PostgreSQL E2E passed 4/4 suites and 28/28 tests. Final browser acceptance after migration deployment passed 10/10 journeys across Farm, Inventory/Finance/Notifications/Reports, Marketplace buyer/seller workspace, Shop browse/compare/cart/profile, listing discovery, Admin blacklist, sandbox chargebacks and consented Farm/Crop context linking.</w:t>
+      </w:r>
+    </w:p>
+    <w:p>
+      <w:r>
+        <w:t xml:space="preserve">Prisma reports 59 migrations and the live schema up to date. The verified full pre-migration database dump is retained in the recovery backup folder. The original rolled-back duplicate migration row is preserved; no database reset or manual migration-history edit was performed.</w:t>
+      </w:r>
+    </w:p>
+    <w:p>
+      <w:r>
+        <w:t xml:space="preserve">Store and Farm are ready for CBA promotion. The next active module is Platform / Registry / Authorization / Admin, to begin only after CBA promotion and canonical main update.</w:t>
       </w:r>
     </w:p>
   </w:body>

</xml_diff>

<commit_message>
feat(shop): optimize catalog density and secure finance views
</commit_message>
<xml_diff>
--- a/Absolutely KK PMD.docx
+++ b/Absolutely KK PMD.docx
@@ -14090,6 +14090,110 @@
       </w:pPr>
       <w:r>
         <w:t>The cart creates authenticated order requests only. Real-money checkout, payment capture, payout, refund/chargeback settlement and tax remittance remain disabled until provider, security, legal/accounting and authenticated end-to-end release gates are accepted.</w:t>
+      </w:r>
+    </w:p>
+    <w:p>
+      <w:pPr>
+        <w:pStyle w:val="Heading1"/>
+      </w:pPr>
+      <w:r>
+        <w:t>Shop storefront compact discovery and progressive-scroll standard - 2026-10-30 22:54:05 IST</w:t>
+      </w:r>
+    </w:p>
+    <w:p>
+      <w:pPr>
+        <w:pStyle w:val="Normal"/>
+      </w:pPr>
+      <w:r>
+        <w:t>Shop and Marketplace remain separate experiences: /app/shop is the shopper-first storefront; /app/marketplace remains the seller/provider, operations and governance workspace. Existing individual listing detail pages and seller workflows must remain intact.</w:t>
+      </w:r>
+    </w:p>
+    <w:p>
+      <w:pPr>
+        <w:pStyle w:val="Normal"/>
+      </w:pPr>
+      <w:r>
+        <w:t>Large-catalog visibility is a product acceptance requirement. Use a responsive compact grid: 2 columns on mobile/default, 3 at small screens, 6 at large screens, 8 at XL and 10 at 2XL. Keep card media lazy-loaded and card content concise; retain a grid/list switch. Do not force desktop density onto narrow screens.</w:t>
+      </w:r>
+    </w:p>
+    <w:p>
+      <w:pPr>
+        <w:pStyle w:val="Normal"/>
+      </w:pPr>
+      <w:r>
+        <w:t>Use date groups Today, Yesterday, Day before yesterday, This week, Last week and Older. Search/category/type/sort filters reset the visible window. Load products progressively in batches of 24 as the scroll sentinel approaches the viewport (500px root margin), with a manual Load 24 more fallback. Avoid rendering an unbounded catalogue in one initial batch.</w:t>
+      </w:r>
+    </w:p>
+    <w:p>
+      <w:pPr>
+        <w:pStyle w:val="Normal"/>
+      </w:pPr>
+      <w:r>
+        <w:t>Acceptance requires computed CSS column counts of 10 at 1600px, 8 at 1280px and 2 at 390px, plus a 50-listing browser test that scroll-loads all 50. External-content-off must suppress external images, embeds and link-outs while preserving approved local uploads.</w:t>
+      </w:r>
+    </w:p>
+    <w:p>
+      <w:pPr>
+        <w:pStyle w:val="Normal"/>
+      </w:pPr>
+      <w:r>
+        <w:t>Verified 2026-10-30: frontend production build passed (522.86 kB main JS / 162.04 kB gzip; non-fatal large-chunk warning); Shop Playwright 4/4 passed, including buyer profile/cart, typed non-product discovery, external-media policy, responsive grid density and progressive 50-item scrolling; git diff --check passed.</w:t>
+      </w:r>
+    </w:p>
+    <w:p>
+      <w:pPr>
+        <w:pStyle w:val="Normal"/>
+      </w:pPr>
+      <w:r>
+        <w:t>Runtime verification: Docker Server 29.8.2 is responding; krishikendram-postgres is Up and accepting connections; read-only database SELECT succeeded; API /api/v1/health and UI root return HTTP 200. No database writes, migrations, Docker resets or volume operations were performed. This Shop UI refinement does not by itself declare the whole Store/Marketplace module production COMPLETE.</w:t>
+      </w:r>
+    </w:p>
+    <w:p>
+      <w:pPr>
+        <w:pStyle w:val="Heading1"/>
+      </w:pPr>
+      <w:r>
+        <w:t>Store and Shop final regression and release checkpoint - 2026-10-30 23:07:39 IST</w:t>
+      </w:r>
+    </w:p>
+    <w:p>
+      <w:pPr>
+        <w:pStyle w:val="Normal"/>
+      </w:pPr>
+      <w:r>
+        <w:t>Full backend regression: 71 suites / 711 tests passed, including Finance authorization and audit coverage. Full frontend Playwright regression: 27/27 passed, including Shop density, progressive 50-item loading, Marketplace journeys and core workflows.</w:t>
+      </w:r>
+    </w:p>
+    <w:p>
+      <w:pPr>
+        <w:pStyle w:val="Normal"/>
+      </w:pPr>
+      <w:r>
+        <w:t>Focused Finance service tests: 5/5 passed. Backend Nest build passed. Frontend production build passed; main bundle 522.86 kB (162.04 kB gzip), with the existing non-fatal large-chunk warning. Shop-specific browser tests: 4/4 passed.</w:t>
+      </w:r>
+    </w:p>
+    <w:p>
+      <w:pPr>
+        <w:pStyle w:val="Normal"/>
+      </w:pPr>
+      <w:r>
+        <w:t>Prisma migrate status: 59 migrations found; database schema is up to date. The canonical execution plan records migration reconciliation, authenticated DB-backed acceptance (4 suites / 28 tests) and Store/Farm browser acceptance (10/10) as complete. Earlier migration-blocker notes are historical and superseded by the later 09:34/09:40 verification.</w:t>
+      </w:r>
+    </w:p>
+    <w:p>
+      <w:pPr>
+        <w:pStyle w:val="Normal"/>
+      </w:pPr>
+      <w:r>
+        <w:t>Shop compact catalog standard: responsive 2/3/6/8/10 columns, lazy-loaded media, 24-item progressive scroll loading and an accessible manual fallback. Full browser acceptance verifies computed 10/8/2 columns and progressive loading of 50 listings.</w:t>
+      </w:r>
+    </w:p>
+    <w:p>
+      <w:pPr>
+        <w:pStyle w:val="Normal"/>
+      </w:pPr>
+      <w:r>
+        <w:t>Live payment capture, refunds, payouts and tax remittance remain disabled pending qualified provider, security, legal and accounting review. No database writes or migrations, Docker resets or volume operations were performed during this continuation.</w:t>
       </w:r>
     </w:p>
     <w:sectPr>

</xml_diff>

<commit_message>
docs(store): record CBA promotion verification
</commit_message>
<xml_diff>
--- a/Absolutely KK PMD.docx
+++ b/Absolutely KK PMD.docx
@@ -14194,6 +14194,38 @@
       </w:pPr>
       <w:r>
         <w:t>Live payment capture, refunds, payouts and tax remittance remain disabled pending qualified provider, security, legal and accounting review. No database writes or migrations, Docker resets or volume operations were performed during this continuation.</w:t>
+      </w:r>
+    </w:p>
+    <w:p>
+      <w:pPr>
+        <w:pStyle w:val="Heading1"/>
+      </w:pPr>
+      <w:r>
+        <w:t>Store and Farm CBA promotion completed - 2026-10-30 23:23:17 IST</w:t>
+      </w:r>
+    </w:p>
+    <w:p>
+      <w:pPr>
+        <w:pStyle w:val="Normal"/>
+      </w:pPr>
+      <w:r>
+        <w:t>C development branch cto/shop-finance-density-20261030 committed 2382200b9755ec6cad24fb02fefb5a5a6bf55366 and pushed to the Integration remote. B Integration main was fast-forwarded, validated and pushed. A canonical origin/main was then fast-forwarded and pushed to the same exact hash.</w:t>
+      </w:r>
+    </w:p>
+    <w:p>
+      <w:pPr>
+        <w:pStyle w:val="Normal"/>
+      </w:pPr>
+      <w:r>
+        <w:t>B verification: backend 71 suites / 711 tests passed; backend build passed; frontend production build passed; Playwright 27/27 passed; Prisma reports 59 migrations and schema up to date; git diff check passed. The C feature branch, B integration main and A canonical main all resolve to the same commit.</w:t>
+      </w:r>
+    </w:p>
+    <w:p>
+      <w:pPr>
+        <w:pStyle w:val="Normal"/>
+      </w:pPr>
+      <w:r>
+        <w:t>Next active module gate: Platform / Registry / Authorization / Admin. Live payment capture, refunds, payouts and tax remittance remain disabled pending provider, security, legal and accounting review.</w:t>
       </w:r>
     </w:p>
     <w:sectPr>

</xml_diff>